<commit_message>
feat(output): Core Abilities Kertas Penerangan in official JPK format (47 docx+pdf), polished; INDEX updated
47 KP built by a python-docx generator reproducing the official zip layout (JPK logo + address block, 6-row identification table on page 1, running NO. KOD / Mukasurat header on pages 2+); page-1 table moved into the body to fix header clipping, markdown asterisks removed, empty trailing row dropped; readability polish applied with 0 text diffs; PDFs exported one Word process per file (47/47, 0 errors). INDEX: 242 deliverables, format-JPK folders, Buku Teks 164/347 pp, readability note.

Co-Authored-By: Claude Opus 5 <noreply@anthropic.com>
</commit_message>
<xml_diff>
--- a/video-film-editing/output/05 3.3b Nota Pembelajaran (Kertas Penerangan)/Core Abilities L1-L3 (format JPK)/KP-CA-01 KP1.1 WORK PLACE WORKING LANGUAGE -(Bahasa Ker (IT-072).docx
+++ b/video-film-editing/output/05 3.3b Nota Pembelajaran (Kertas Penerangan)/Core Abilities L1-L3 (format JPK)/KP-CA-01 KP1.1 WORK PLACE WORKING LANGUAGE -(Bahasa Ker (IT-072).docx
@@ -2,84 +2,705 @@
 <file path=word/document.xml><?xml version="1.0" encoding="utf-8"?>
 <w:document xmlns:wpc="http://schemas.microsoft.com/office/word/2010/wordprocessingCanvas" xmlns:mo="http://schemas.microsoft.com/office/mac/office/2008/main" xmlns:mc="http://schemas.openxmlformats.org/markup-compatibility/2006" xmlns:mv="urn:schemas-microsoft-com:mac:vml" xmlns:o="urn:schemas-microsoft-com:office:office" xmlns:r="http://schemas.openxmlformats.org/officeDocument/2006/relationships" xmlns:m="http://schemas.openxmlformats.org/officeDocument/2006/math" xmlns:v="urn:schemas-microsoft-com:vml" xmlns:wp14="http://schemas.microsoft.com/office/word/2010/wordprocessingDrawing" xmlns:wp="http://schemas.openxmlformats.org/drawingml/2006/wordprocessingDrawing" xmlns:w10="urn:schemas-microsoft-com:office:word" xmlns:w="http://schemas.openxmlformats.org/wordprocessingml/2006/main" xmlns:w14="http://schemas.microsoft.com/office/word/2010/wordml" xmlns:wpg="http://schemas.microsoft.com/office/word/2010/wordprocessingGroup" xmlns:wpi="http://schemas.microsoft.com/office/word/2010/wordprocessingInk" xmlns:wne="http://schemas.microsoft.com/office/word/2006/wordml" xmlns:wps="http://schemas.microsoft.com/office/word/2010/wordprocessingShape" mc:Ignorable="w14 wp14">
   <w:body>
+    <w:tbl>
+      <w:tblPr>
+        <w:tblW w:type="auto" w:w="0"/>
+        <w:jc w:val="center"/>
+        <w:tblLook w:firstColumn="1" w:firstRow="1" w:lastColumn="0" w:lastRow="0" w:noHBand="0" w:noVBand="1" w:val="04A0"/>
+        <w:tblBorders>
+          <w:top w:val="single" w:sz="4" w:space="0" w:color="000000"/>
+          <w:left w:val="single" w:sz="4" w:space="0" w:color="000000"/>
+          <w:bottom w:val="single" w:sz="4" w:space="0" w:color="000000"/>
+          <w:right w:val="single" w:sz="4" w:space="0" w:color="000000"/>
+          <w:insideH w:val="single" w:sz="4" w:space="0" w:color="000000"/>
+          <w:insideV w:val="single" w:sz="4" w:space="0" w:color="000000"/>
+        </w:tblBorders>
+      </w:tblPr>
+      <w:tblGrid>
+        <w:gridCol w:w="3213"/>
+        <w:gridCol w:w="3213"/>
+        <w:gridCol w:w="3213"/>
+      </w:tblGrid>
+      <w:tr>
+        <w:tc>
+          <w:tcPr>
+            <w:tcW w:type="dxa" w:w="2551"/>
+            <w:vAlign w:val="center"/>
+            <w:tcMar>
+              <w:top w:w="40" w:type="dxa"/>
+              <w:bottom w:w="40" w:type="dxa"/>
+              <w:start w:w="80" w:type="dxa"/>
+              <w:end w:w="80" w:type="dxa"/>
+            </w:tcMar>
+          </w:tcPr>
+          <w:p>
+            <w:pPr>
+              <w:jc w:val="left"/>
+            </w:pPr>
+            <w:r>
+              <w:drawing>
+                <wp:inline xmlns:a="http://schemas.openxmlformats.org/drawingml/2006/main" xmlns:pic="http://schemas.openxmlformats.org/drawingml/2006/picture">
+                  <wp:extent cx="885785" cy="1404000"/>
+                  <wp:docPr id="1" name="Picture 1"/>
+                  <wp:cNvGraphicFramePr>
+                    <a:graphicFrameLocks noChangeAspect="1"/>
+                  </wp:cNvGraphicFramePr>
+                  <a:graphic>
+                    <a:graphicData uri="http://schemas.openxmlformats.org/drawingml/2006/picture">
+                      <pic:pic>
+                        <pic:nvPicPr>
+                          <pic:cNvPr id="0" name="jpk-logo-official.png"/>
+                          <pic:cNvPicPr/>
+                        </pic:nvPicPr>
+                        <pic:blipFill>
+                          <a:blip r:embed="rId13"/>
+                          <a:stretch>
+                            <a:fillRect/>
+                          </a:stretch>
+                        </pic:blipFill>
+                        <pic:spPr>
+                          <a:xfrm>
+                            <a:off x="0" y="0"/>
+                            <a:ext cx="885785" cy="1404000"/>
+                          </a:xfrm>
+                          <a:prstGeom prst="rect"/>
+                        </pic:spPr>
+                      </pic:pic>
+                    </a:graphicData>
+                  </a:graphic>
+                </wp:inline>
+              </w:drawing>
+            </w:r>
+          </w:p>
+        </w:tc>
+        <w:tc>
+          <w:tcPr>
+            <w:tcW w:type="dxa" w:w="2268"/>
+            <w:gridSpan w:val="2"/>
+            <w:tcMar>
+              <w:top w:w="40" w:type="dxa"/>
+              <w:bottom w:w="40" w:type="dxa"/>
+              <w:start w:w="80" w:type="dxa"/>
+              <w:end w:w="80" w:type="dxa"/>
+            </w:tcMar>
+            <w:tcMar>
+              <w:top w:w="40" w:type="dxa"/>
+              <w:bottom w:w="40" w:type="dxa"/>
+              <w:start w:w="80" w:type="dxa"/>
+              <w:end w:w="80" w:type="dxa"/>
+            </w:tcMar>
+          </w:tcPr>
+          <w:p>
+            <w:r/>
+            <w:r>
+              <w:rPr>
+                <w:rFonts w:ascii="Arial" w:hAnsi="Arial"/>
+                <w:b/>
+                <w:sz w:val="22"/>
+              </w:rPr>
+              <w:t>JABATAN PEMBANGUNAN KEMAHIRAN</w:t>
+            </w:r>
+          </w:p>
+          <w:p>
+            <w:r>
+              <w:rPr>
+                <w:rFonts w:ascii="Arial" w:hAnsi="Arial"/>
+                <w:b/>
+                <w:sz w:val="22"/>
+              </w:rPr>
+              <w:t>KEMENTERIAN SUMBER MANUSIA</w:t>
+            </w:r>
+          </w:p>
+          <w:p>
+            <w:r>
+              <w:rPr>
+                <w:rFonts w:ascii="Arial" w:hAnsi="Arial"/>
+                <w:b/>
+                <w:sz w:val="22"/>
+              </w:rPr>
+              <w:t>ARAS 7 &amp; 8 BLOK D4, KOMPLEK D</w:t>
+            </w:r>
+          </w:p>
+          <w:p>
+            <w:r>
+              <w:rPr>
+                <w:rFonts w:ascii="Arial" w:hAnsi="Arial"/>
+                <w:b/>
+                <w:sz w:val="22"/>
+              </w:rPr>
+              <w:t>PUSAT PENTADBIRAN KERAJAAN PERSEKUTUAN</w:t>
+            </w:r>
+          </w:p>
+          <w:p>
+            <w:r>
+              <w:rPr>
+                <w:rFonts w:ascii="Arial" w:hAnsi="Arial"/>
+                <w:b/>
+                <w:sz w:val="22"/>
+              </w:rPr>
+              <w:t>62530 PUTRAJAYA</w:t>
+            </w:r>
+          </w:p>
+          <w:p/>
+          <w:p>
+            <w:r>
+              <w:rPr>
+                <w:rFonts w:ascii="Arial" w:hAnsi="Arial"/>
+                <w:b/>
+                <w:sz w:val="40"/>
+              </w:rPr>
+              <w:t>KERTAS PENERANGAN</w:t>
+            </w:r>
+          </w:p>
+          <w:p>
+            <w:r>
+              <w:rPr>
+                <w:rFonts w:ascii="Arial" w:hAnsi="Arial"/>
+                <w:b/>
+                <w:sz w:val="24"/>
+              </w:rPr>
+              <w:t>(</w:t>
+            </w:r>
+            <w:r>
+              <w:rPr>
+                <w:rFonts w:ascii="Arial" w:hAnsi="Arial"/>
+                <w:b/>
+                <w:i/>
+                <w:sz w:val="24"/>
+              </w:rPr>
+              <w:t>INFORMATION SHEET</w:t>
+            </w:r>
+            <w:r>
+              <w:rPr>
+                <w:rFonts w:ascii="Arial" w:hAnsi="Arial"/>
+                <w:b/>
+                <w:sz w:val="24"/>
+              </w:rPr>
+              <w:t>)</w:t>
+            </w:r>
+          </w:p>
+        </w:tc>
+      </w:tr>
+      <w:tr>
+        <w:tc>
+          <w:tcPr>
+            <w:tcW w:type="dxa" w:w="2551"/>
+            <w:tcMar>
+              <w:top w:w="40" w:type="dxa"/>
+              <w:bottom w:w="40" w:type="dxa"/>
+              <w:start w:w="80" w:type="dxa"/>
+              <w:end w:w="80" w:type="dxa"/>
+            </w:tcMar>
+          </w:tcPr>
+          <w:p>
+            <w:r/>
+            <w:r>
+              <w:rPr>
+                <w:rFonts w:ascii="Arial" w:hAnsi="Arial"/>
+                <w:b/>
+                <w:sz w:val="22"/>
+              </w:rPr>
+              <w:t xml:space="preserve">KOD DAN NAMA PROGRAM / </w:t>
+            </w:r>
+            <w:r>
+              <w:rPr>
+                <w:rFonts w:ascii="Arial" w:hAnsi="Arial"/>
+                <w:b/>
+                <w:i/>
+                <w:sz w:val="22"/>
+              </w:rPr>
+              <w:t>PROGRAM'S CODE AND NAME</w:t>
+            </w:r>
+          </w:p>
+        </w:tc>
+        <w:tc>
+          <w:tcPr>
+            <w:tcW w:type="dxa" w:w="2268"/>
+            <w:gridSpan w:val="2"/>
+            <w:tcMar>
+              <w:top w:w="40" w:type="dxa"/>
+              <w:bottom w:w="40" w:type="dxa"/>
+              <w:start w:w="80" w:type="dxa"/>
+              <w:end w:w="80" w:type="dxa"/>
+            </w:tcMar>
+            <w:tcMar>
+              <w:top w:w="40" w:type="dxa"/>
+              <w:bottom w:w="40" w:type="dxa"/>
+              <w:start w:w="80" w:type="dxa"/>
+              <w:end w:w="80" w:type="dxa"/>
+            </w:tcMar>
+          </w:tcPr>
+          <w:p>
+            <w:r/>
+            <w:r>
+              <w:rPr>
+                <w:rFonts w:ascii="Arial" w:hAnsi="Arial"/>
+                <w:b/>
+                <w:i w:val="0"/>
+                <w:sz w:val="22"/>
+              </w:rPr>
+              <w:t>Z-009-1:2015 CORE ABILITIES (untuk program IT-072-3:2012 VIDEO / FILM (EDITING))</w:t>
+            </w:r>
+          </w:p>
+        </w:tc>
+      </w:tr>
+      <w:tr>
+        <w:tc>
+          <w:tcPr>
+            <w:tcW w:type="dxa" w:w="2551"/>
+            <w:tcMar>
+              <w:top w:w="40" w:type="dxa"/>
+              <w:bottom w:w="40" w:type="dxa"/>
+              <w:start w:w="80" w:type="dxa"/>
+              <w:end w:w="80" w:type="dxa"/>
+            </w:tcMar>
+          </w:tcPr>
+          <w:p>
+            <w:r/>
+            <w:r>
+              <w:rPr>
+                <w:rFonts w:ascii="Arial" w:hAnsi="Arial"/>
+                <w:b/>
+                <w:sz w:val="22"/>
+              </w:rPr>
+              <w:t xml:space="preserve">TAHAP / </w:t>
+            </w:r>
+            <w:r>
+              <w:rPr>
+                <w:rFonts w:ascii="Arial" w:hAnsi="Arial"/>
+                <w:b/>
+                <w:i/>
+                <w:sz w:val="22"/>
+              </w:rPr>
+              <w:t>LEVEL</w:t>
+            </w:r>
+          </w:p>
+        </w:tc>
+        <w:tc>
+          <w:tcPr>
+            <w:tcW w:type="dxa" w:w="2268"/>
+            <w:gridSpan w:val="2"/>
+            <w:tcMar>
+              <w:top w:w="40" w:type="dxa"/>
+              <w:bottom w:w="40" w:type="dxa"/>
+              <w:start w:w="80" w:type="dxa"/>
+              <w:end w:w="80" w:type="dxa"/>
+            </w:tcMar>
+            <w:tcMar>
+              <w:top w:w="40" w:type="dxa"/>
+              <w:bottom w:w="40" w:type="dxa"/>
+              <w:start w:w="80" w:type="dxa"/>
+              <w:end w:w="80" w:type="dxa"/>
+            </w:tcMar>
+          </w:tcPr>
+          <w:p>
+            <w:r/>
+            <w:r>
+              <w:rPr>
+                <w:rFonts w:ascii="Arial" w:hAnsi="Arial"/>
+                <w:b/>
+                <w:i w:val="0"/>
+                <w:sz w:val="22"/>
+              </w:rPr>
+              <w:t>1</w:t>
+            </w:r>
+          </w:p>
+        </w:tc>
+      </w:tr>
+      <w:tr>
+        <w:tc>
+          <w:tcPr>
+            <w:tcW w:type="dxa" w:w="2551"/>
+            <w:tcMar>
+              <w:top w:w="40" w:type="dxa"/>
+              <w:bottom w:w="40" w:type="dxa"/>
+              <w:start w:w="80" w:type="dxa"/>
+              <w:end w:w="80" w:type="dxa"/>
+            </w:tcMar>
+          </w:tcPr>
+          <w:p>
+            <w:r/>
+            <w:r>
+              <w:rPr>
+                <w:rFonts w:ascii="Arial" w:hAnsi="Arial"/>
+                <w:b/>
+                <w:sz w:val="22"/>
+              </w:rPr>
+              <w:t xml:space="preserve">NO. DAN TAJUK KEBOLEHAN TERAS / </w:t>
+            </w:r>
+            <w:r>
+              <w:rPr>
+                <w:rFonts w:ascii="Arial" w:hAnsi="Arial"/>
+                <w:b/>
+                <w:i/>
+                <w:sz w:val="22"/>
+              </w:rPr>
+              <w:t>CORE ABILITY NO. AND TITLE</w:t>
+            </w:r>
+          </w:p>
+        </w:tc>
+        <w:tc>
+          <w:tcPr>
+            <w:tcW w:type="dxa" w:w="2268"/>
+            <w:gridSpan w:val="2"/>
+            <w:tcMar>
+              <w:top w:w="40" w:type="dxa"/>
+              <w:bottom w:w="40" w:type="dxa"/>
+              <w:start w:w="80" w:type="dxa"/>
+              <w:end w:w="80" w:type="dxa"/>
+            </w:tcMar>
+            <w:tcMar>
+              <w:top w:w="40" w:type="dxa"/>
+              <w:bottom w:w="40" w:type="dxa"/>
+              <w:start w:w="80" w:type="dxa"/>
+              <w:end w:w="80" w:type="dxa"/>
+            </w:tcMar>
+          </w:tcPr>
+          <w:p>
+            <w:r/>
+            <w:r>
+              <w:rPr>
+                <w:rFonts w:ascii="Arial" w:hAnsi="Arial"/>
+                <w:b/>
+                <w:i w:val="0"/>
+                <w:sz w:val="22"/>
+              </w:rPr>
+              <w:t>CA01 BASIC WORKING COMMUNICATION (KEBOLEHAN KERJA ASAS KOMUNIKASI)</w:t>
+            </w:r>
+          </w:p>
+        </w:tc>
+      </w:tr>
+      <w:tr>
+        <w:tc>
+          <w:tcPr>
+            <w:tcW w:type="dxa" w:w="2551"/>
+            <w:tcMar>
+              <w:top w:w="40" w:type="dxa"/>
+              <w:bottom w:w="40" w:type="dxa"/>
+              <w:start w:w="80" w:type="dxa"/>
+              <w:end w:w="80" w:type="dxa"/>
+            </w:tcMar>
+          </w:tcPr>
+          <w:p>
+            <w:r/>
+            <w:r>
+              <w:rPr>
+                <w:rFonts w:ascii="Arial" w:hAnsi="Arial"/>
+                <w:b/>
+                <w:sz w:val="22"/>
+              </w:rPr>
+              <w:t xml:space="preserve">NO. DAN PENYATAAN KEBOLEHAN / </w:t>
+            </w:r>
+            <w:r>
+              <w:rPr>
+                <w:rFonts w:ascii="Arial" w:hAnsi="Arial"/>
+                <w:b/>
+                <w:i/>
+                <w:sz w:val="22"/>
+              </w:rPr>
+              <w:t>ABILITY NO. AND STATEMENT</w:t>
+            </w:r>
+          </w:p>
+        </w:tc>
+        <w:tc>
+          <w:tcPr>
+            <w:tcW w:type="dxa" w:w="2268"/>
+            <w:gridSpan w:val="2"/>
+            <w:tcMar>
+              <w:top w:w="40" w:type="dxa"/>
+              <w:bottom w:w="40" w:type="dxa"/>
+              <w:start w:w="80" w:type="dxa"/>
+              <w:end w:w="80" w:type="dxa"/>
+            </w:tcMar>
+            <w:tcMar>
+              <w:top w:w="40" w:type="dxa"/>
+              <w:bottom w:w="40" w:type="dxa"/>
+              <w:start w:w="80" w:type="dxa"/>
+              <w:end w:w="80" w:type="dxa"/>
+            </w:tcMar>
+          </w:tcPr>
+          <w:p>
+            <w:r/>
+            <w:r>
+              <w:rPr>
+                <w:rFonts w:ascii="Arial" w:hAnsi="Arial"/>
+                <w:b/>
+                <w:i w:val="0"/>
+                <w:sz w:val="22"/>
+              </w:rPr>
+              <w:t xml:space="preserve">01.01 APPLY WORKING LANGUAGE APPROPRIATE (ENGLISH / NATIONAL LANGUAGE ETC) </w:t>
+            </w:r>
+            <w:r>
+              <w:rPr>
+                <w:rFonts w:ascii="Arial" w:hAnsi="Arial"/>
+                <w:b/>
+                <w:i/>
+                <w:sz w:val="22"/>
+              </w:rPr>
+              <w:t>(Menggunakan bahasa kerja yang sesuai — Bahasa Inggeris / Bahasa Kebangsaan dsb.)</w:t>
+            </w:r>
+          </w:p>
+        </w:tc>
+      </w:tr>
+      <w:tr>
+        <w:tc>
+          <w:tcPr>
+            <w:tcW w:type="dxa" w:w="2551"/>
+            <w:tcMar>
+              <w:top w:w="40" w:type="dxa"/>
+              <w:bottom w:w="40" w:type="dxa"/>
+              <w:start w:w="80" w:type="dxa"/>
+              <w:end w:w="80" w:type="dxa"/>
+            </w:tcMar>
+          </w:tcPr>
+          <w:p>
+            <w:r/>
+            <w:r>
+              <w:rPr>
+                <w:rFonts w:ascii="Arial" w:hAnsi="Arial"/>
+                <w:b/>
+                <w:sz w:val="22"/>
+              </w:rPr>
+              <w:t xml:space="preserve">NO. KOD / </w:t>
+            </w:r>
+            <w:r>
+              <w:rPr>
+                <w:rFonts w:ascii="Arial" w:hAnsi="Arial"/>
+                <w:b/>
+                <w:i/>
+                <w:sz w:val="22"/>
+              </w:rPr>
+              <w:t>CODE NO.</w:t>
+            </w:r>
+          </w:p>
+        </w:tc>
+        <w:tc>
+          <w:tcPr>
+            <w:tcW w:type="dxa" w:w="4819"/>
+            <w:tcMar>
+              <w:top w:w="40" w:type="dxa"/>
+              <w:bottom w:w="40" w:type="dxa"/>
+              <w:start w:w="80" w:type="dxa"/>
+              <w:end w:w="80" w:type="dxa"/>
+            </w:tcMar>
+          </w:tcPr>
+          <w:p>
+            <w:r/>
+            <w:r>
+              <w:rPr>
+                <w:rFonts w:ascii="Arial" w:hAnsi="Arial"/>
+                <w:b/>
+                <w:i w:val="0"/>
+                <w:sz w:val="22"/>
+              </w:rPr>
+              <w:t>Z-009-1:2015-M01/P(1/3)</w:t>
+            </w:r>
+          </w:p>
+        </w:tc>
+        <w:tc>
+          <w:tcPr>
+            <w:tcW w:type="dxa" w:w="2268"/>
+            <w:tcMar>
+              <w:top w:w="40" w:type="dxa"/>
+              <w:bottom w:w="40" w:type="dxa"/>
+              <w:start w:w="80" w:type="dxa"/>
+              <w:end w:w="80" w:type="dxa"/>
+            </w:tcMar>
+          </w:tcPr>
+          <w:p>
+            <w:r/>
+            <w:r>
+              <w:rPr>
+                <w:rFonts w:ascii="Arial" w:hAnsi="Arial"/>
+                <w:b/>
+                <w:sz w:val="22"/>
+              </w:rPr>
+              <w:t xml:space="preserve">Mukasurat / </w:t>
+            </w:r>
+            <w:r>
+              <w:rPr>
+                <w:rFonts w:ascii="Arial" w:hAnsi="Arial"/>
+                <w:b/>
+                <w:i/>
+                <w:sz w:val="22"/>
+              </w:rPr>
+              <w:t>Page</w:t>
+            </w:r>
+            <w:r>
+              <w:rPr>
+                <w:rFonts w:ascii="Arial" w:hAnsi="Arial"/>
+                <w:b/>
+                <w:sz w:val="22"/>
+              </w:rPr>
+              <w:t xml:space="preserve"> : </w:t>
+            </w:r>
+            <w:r>
+              <w:rPr>
+                <w:rFonts w:ascii="Arial" w:hAnsi="Arial"/>
+                <w:b/>
+                <w:sz w:val="22"/>
+              </w:rPr>
+              <w:fldChar w:fldCharType="begin"/>
+              <w:instrText xml:space="preserve">PAGE</w:instrText>
+              <w:fldChar w:fldCharType="separate"/>
+              <w:t>1</w:t>
+              <w:fldChar w:fldCharType="end"/>
+            </w:r>
+          </w:p>
+          <w:p>
+            <w:r>
+              <w:rPr>
+                <w:rFonts w:ascii="Arial" w:hAnsi="Arial"/>
+                <w:b/>
+                <w:sz w:val="22"/>
+              </w:rPr>
+              <w:t xml:space="preserve">Drpd / </w:t>
+            </w:r>
+            <w:r>
+              <w:rPr>
+                <w:rFonts w:ascii="Arial" w:hAnsi="Arial"/>
+                <w:b/>
+                <w:i/>
+                <w:sz w:val="22"/>
+              </w:rPr>
+              <w:t>of</w:t>
+            </w:r>
+            <w:r>
+              <w:rPr>
+                <w:rFonts w:ascii="Arial" w:hAnsi="Arial"/>
+                <w:b/>
+                <w:sz w:val="22"/>
+              </w:rPr>
+              <w:t xml:space="preserve"> : </w:t>
+            </w:r>
+            <w:r>
+              <w:rPr>
+                <w:rFonts w:ascii="Arial" w:hAnsi="Arial"/>
+                <w:b/>
+                <w:sz w:val="22"/>
+              </w:rPr>
+              <w:fldChar w:fldCharType="begin"/>
+              <w:instrText xml:space="preserve">NUMPAGES</w:instrText>
+              <w:fldChar w:fldCharType="separate"/>
+              <w:t>1</w:t>
+              <w:fldChar w:fldCharType="end"/>
+            </w:r>
+          </w:p>
+        </w:tc>
+      </w:tr>
+    </w:tbl>
+    <w:p/>
     <w:p>
+      <w:pPr>
+        <w:spacing w:line="276" w:lineRule="auto" w:after="120"/>
+        <w:jc w:val="left"/>
+      </w:pPr>
       <w:r>
         <w:rPr>
-          <w:rFonts w:ascii="Arial" w:hAnsi="Arial"/>
+          <w:rFonts w:ascii="Arial" w:hAnsi="Arial" w:cs="Arial"/>
           <w:b/>
-          <w:sz w:val="24"/>
+          <w:color w:val="000000"/>
+          <w:sz w:val="22"/>
         </w:rPr>
         <w:t>TAJUK</w:t>
       </w:r>
       <w:r>
         <w:rPr>
-          <w:rFonts w:ascii="Arial" w:hAnsi="Arial"/>
+          <w:rFonts w:ascii="Arial" w:hAnsi="Arial" w:cs="Arial"/>
           <w:b/>
-          <w:sz w:val="24"/>
+          <w:color w:val="000000"/>
+          <w:sz w:val="22"/>
         </w:rPr>
         <w:t>/</w:t>
       </w:r>
       <w:r>
         <w:rPr>
-          <w:rFonts w:ascii="Arial" w:hAnsi="Arial"/>
+          <w:rFonts w:ascii="Arial" w:hAnsi="Arial" w:cs="Arial"/>
           <w:b/>
           <w:i/>
-          <w:sz w:val="24"/>
+          <w:color w:val="000000"/>
+          <w:sz w:val="22"/>
         </w:rPr>
         <w:t>TITLE</w:t>
       </w:r>
       <w:r>
         <w:rPr>
-          <w:rFonts w:ascii="Arial" w:hAnsi="Arial"/>
+          <w:rFonts w:ascii="Arial" w:hAnsi="Arial" w:cs="Arial"/>
           <w:b/>
-          <w:sz w:val="24"/>
+          <w:color w:val="000000"/>
+          <w:sz w:val="22"/>
         </w:rPr>
         <w:t>:</w:t>
       </w:r>
       <w:r>
+        <w:rPr>
+          <w:rFonts w:ascii="Arial" w:hAnsi="Arial" w:cs="Arial"/>
+          <w:color w:val="000000"/>
+          <w:sz w:val="22"/>
+        </w:rPr>
         <w:t xml:space="preserve">  </w:t>
       </w:r>
       <w:r>
         <w:rPr>
-          <w:rFonts w:ascii="Arial" w:hAnsi="Arial"/>
+          <w:rFonts w:ascii="Arial" w:hAnsi="Arial" w:cs="Arial"/>
           <w:b/>
-          <w:sz w:val="24"/>
+          <w:i w:val="0"/>
+          <w:color w:val="000000"/>
+          <w:sz w:val="22"/>
         </w:rPr>
-        <w:t>WORK PLACE WORKING LANGUAGE *(Bahasa Kerja Di Tempat Kerja)*</w:t>
+        <w:t xml:space="preserve">WORK PLACE WORKING LANGUAGE </w:t>
+      </w:r>
+      <w:r>
+        <w:rPr>
+          <w:rFonts w:ascii="Arial" w:hAnsi="Arial" w:cs="Arial"/>
+          <w:b/>
+          <w:i/>
+          <w:color w:val="000000"/>
+          <w:sz w:val="22"/>
+        </w:rPr>
+        <w:t>(Bahasa Kerja Di Tempat Kerja)</w:t>
       </w:r>
     </w:p>
     <w:p/>
     <w:p>
+      <w:pPr>
+        <w:spacing w:line="276" w:lineRule="auto" w:after="120"/>
+        <w:jc w:val="left"/>
+      </w:pPr>
       <w:r>
         <w:rPr>
-          <w:rFonts w:ascii="Arial" w:hAnsi="Arial"/>
+          <w:rFonts w:ascii="Arial" w:hAnsi="Arial" w:cs="Arial"/>
           <w:b/>
-          <w:sz w:val="24"/>
+          <w:color w:val="000000"/>
+          <w:sz w:val="22"/>
         </w:rPr>
         <w:t>TUJUAN</w:t>
       </w:r>
       <w:r>
         <w:rPr>
-          <w:rFonts w:ascii="Arial" w:hAnsi="Arial"/>
+          <w:rFonts w:ascii="Arial" w:hAnsi="Arial" w:cs="Arial"/>
           <w:b/>
-          <w:sz w:val="24"/>
+          <w:color w:val="000000"/>
+          <w:sz w:val="22"/>
         </w:rPr>
         <w:t>/</w:t>
       </w:r>
       <w:r>
         <w:rPr>
-          <w:rFonts w:ascii="Arial" w:hAnsi="Arial"/>
+          <w:rFonts w:ascii="Arial" w:hAnsi="Arial" w:cs="Arial"/>
           <w:b/>
           <w:i/>
-          <w:sz w:val="24"/>
+          <w:color w:val="000000"/>
+          <w:sz w:val="22"/>
         </w:rPr>
         <w:t>PURPOSE</w:t>
       </w:r>
       <w:r>
         <w:rPr>
-          <w:rFonts w:ascii="Arial" w:hAnsi="Arial"/>
+          <w:rFonts w:ascii="Arial" w:hAnsi="Arial" w:cs="Arial"/>
           <w:b/>
-          <w:sz w:val="24"/>
+          <w:color w:val="000000"/>
+          <w:sz w:val="22"/>
         </w:rPr>
         <w:t>:</w:t>
       </w:r>
@@ -87,13 +708,15 @@
     <w:p/>
     <w:p>
       <w:pPr>
-        <w:spacing w:after="160"/>
+        <w:spacing w:after="120" w:line="276" w:lineRule="auto"/>
+        <w:jc w:val="left"/>
       </w:pPr>
       <w:r>
         <w:rPr>
-          <w:rFonts w:ascii="Arial" w:hAnsi="Arial"/>
+          <w:rFonts w:ascii="Arial" w:hAnsi="Arial" w:cs="Arial"/>
           <w:b w:val="0"/>
           <w:i w:val="0"/>
+          <w:color w:val="000000"/>
           <w:sz w:val="22"/>
         </w:rPr>
         <w:t>Kertas Penerangan ini bertujuan menerangkan keperluan berkomunikasi secara jelas dari segi idea dan maklumat, amalan organisasi, dan kepentingan budaya dalam komunikasi. Seseorang yang cekap dalam CA ini mesti dapat berkomunikasi secara berkesan menggunakan bahasa dan format yang sesuai, serta memahami amalan organisasi dan komunikasi antara budaya.</w:t>
@@ -101,49 +724,59 @@
     </w:p>
     <w:p>
       <w:pPr>
-        <w:spacing w:after="160"/>
+        <w:spacing w:after="120" w:line="276" w:lineRule="auto"/>
+        <w:jc w:val="left"/>
       </w:pPr>
       <w:r>
         <w:rPr>
-          <w:rFonts w:ascii="Arial" w:hAnsi="Arial"/>
+          <w:rFonts w:ascii="Arial" w:hAnsi="Arial" w:cs="Arial"/>
           <w:b w:val="0"/>
           <w:i/>
+          <w:color w:val="000000"/>
           <w:sz w:val="22"/>
         </w:rPr>
         <w:t>(PURPOSE — rasmi: "This Information Sheet is intended to describe on the requirement to communicate ideas and information clearly, organizational practices and the importance of culture in communication. The person who is competent in this CA shall be able to communicate effectively using appropriate language and formats as well as understand organizational practices and intercultural communication.")</w:t>
       </w:r>
     </w:p>
     <w:p>
+      <w:pPr>
+        <w:spacing w:line="276" w:lineRule="auto" w:after="120"/>
+        <w:jc w:val="left"/>
+      </w:pPr>
       <w:r>
         <w:rPr>
-          <w:rFonts w:ascii="Arial" w:hAnsi="Arial"/>
+          <w:rFonts w:ascii="Arial" w:hAnsi="Arial" w:cs="Arial"/>
           <w:b/>
-          <w:sz w:val="24"/>
+          <w:color w:val="000000"/>
+          <w:sz w:val="22"/>
         </w:rPr>
         <w:t>PENERANGAN</w:t>
       </w:r>
       <w:r>
         <w:rPr>
-          <w:rFonts w:ascii="Arial" w:hAnsi="Arial"/>
+          <w:rFonts w:ascii="Arial" w:hAnsi="Arial" w:cs="Arial"/>
           <w:b/>
-          <w:sz w:val="24"/>
+          <w:color w:val="000000"/>
+          <w:sz w:val="22"/>
         </w:rPr>
         <w:t>/</w:t>
       </w:r>
       <w:r>
         <w:rPr>
-          <w:rFonts w:ascii="Arial" w:hAnsi="Arial"/>
+          <w:rFonts w:ascii="Arial" w:hAnsi="Arial" w:cs="Arial"/>
           <w:b/>
           <w:i/>
-          <w:sz w:val="24"/>
+          <w:color w:val="000000"/>
+          <w:sz w:val="22"/>
         </w:rPr>
         <w:t>INFORMATION</w:t>
       </w:r>
       <w:r>
         <w:rPr>
-          <w:rFonts w:ascii="Arial" w:hAnsi="Arial"/>
+          <w:rFonts w:ascii="Arial" w:hAnsi="Arial" w:cs="Arial"/>
           <w:b/>
-          <w:sz w:val="24"/>
+          <w:color w:val="000000"/>
+          <w:sz w:val="22"/>
         </w:rPr>
         <w:t>:</w:t>
       </w:r>
@@ -151,45 +784,51 @@
     <w:p/>
     <w:p>
       <w:pPr>
-        <w:spacing w:before="200"/>
+        <w:spacing w:before="120" w:after="120" w:line="276" w:lineRule="auto"/>
+        <w:jc w:val="left"/>
       </w:pPr>
       <w:r>
         <w:rPr>
-          <w:rFonts w:ascii="Arial" w:hAnsi="Arial"/>
+          <w:rFonts w:ascii="Arial" w:hAnsi="Arial" w:cs="Arial"/>
           <w:b/>
           <w:i w:val="0"/>
-          <w:sz w:val="24"/>
+          <w:color w:val="000000"/>
+          <w:sz w:val="22"/>
         </w:rPr>
         <w:t xml:space="preserve">1. Types of Working Language </w:t>
       </w:r>
       <w:r>
         <w:rPr>
-          <w:rFonts w:ascii="Arial" w:hAnsi="Arial"/>
+          <w:rFonts w:ascii="Arial" w:hAnsi="Arial" w:cs="Arial"/>
           <w:b/>
           <w:i/>
-          <w:sz w:val="24"/>
+          <w:color w:val="000000"/>
+          <w:sz w:val="22"/>
         </w:rPr>
         <w:t>(Jenis Bahasa Kerja)</w:t>
       </w:r>
     </w:p>
     <w:p>
       <w:pPr>
-        <w:spacing w:after="160"/>
+        <w:spacing w:after="120" w:line="276" w:lineRule="auto"/>
+        <w:jc w:val="left"/>
       </w:pPr>
       <w:r>
         <w:rPr>
-          <w:rFonts w:ascii="Arial" w:hAnsi="Arial"/>
+          <w:rFonts w:ascii="Arial" w:hAnsi="Arial" w:cs="Arial"/>
           <w:b/>
           <w:i w:val="0"/>
+          <w:color w:val="000000"/>
           <w:sz w:val="22"/>
         </w:rPr>
         <w:t>1.1</w:t>
       </w:r>
       <w:r>
         <w:rPr>
-          <w:rFonts w:ascii="Arial" w:hAnsi="Arial"/>
+          <w:rFonts w:ascii="Arial" w:hAnsi="Arial" w:cs="Arial"/>
           <w:b w:val="0"/>
           <w:i w:val="0"/>
+          <w:color w:val="000000"/>
           <w:sz w:val="22"/>
         </w:rPr>
         <w:t xml:space="preserve"> Dalam setiap jenis kerja, kemahiran bahasa diperlukan untuk berkomunikasi dengan klien dan rakan kongsi, sama ada dekat mahupun jauh. Kemahiran bahasa yang baik jelas meningkatkan peluang perkembangan kerjaya. Semakin mencabar sesuatu tugas, semakin luas kemahiran bahasa yang diperlukan oleh pekerja itu. Pada masa yang sama, keperluan kemahiran bahasa dalam pelbagai vokasi terus meningkat.</w:t>
@@ -197,148 +836,165 @@
     </w:p>
     <w:p>
       <w:pPr>
-        <w:spacing w:after="160"/>
+        <w:spacing w:after="120" w:line="276" w:lineRule="auto"/>
+        <w:jc w:val="left"/>
       </w:pPr>
       <w:r>
         <w:rPr>
-          <w:rFonts w:ascii="Arial" w:hAnsi="Arial"/>
+          <w:rFonts w:ascii="Arial" w:hAnsi="Arial" w:cs="Arial"/>
           <w:b w:val="0"/>
           <w:i/>
+          <w:color w:val="000000"/>
           <w:sz w:val="22"/>
         </w:rPr>
         <w:t>Contoh studio penyuntingan video:</w:t>
       </w:r>
       <w:r>
         <w:rPr>
-          <w:rFonts w:ascii="Arial" w:hAnsi="Arial"/>
+          <w:rFonts w:ascii="Arial" w:hAnsi="Arial" w:cs="Arial"/>
           <w:b w:val="0"/>
           <w:i w:val="0"/>
+          <w:color w:val="000000"/>
           <w:sz w:val="22"/>
         </w:rPr>
         <w:t xml:space="preserve"> seorang </w:t>
       </w:r>
       <w:r>
         <w:rPr>
-          <w:rFonts w:ascii="Arial" w:hAnsi="Arial"/>
+          <w:rFonts w:ascii="Arial" w:hAnsi="Arial" w:cs="Arial"/>
           <w:b w:val="0"/>
           <w:i/>
+          <w:color w:val="000000"/>
           <w:sz w:val="22"/>
         </w:rPr>
         <w:t>Video Editor</w:t>
       </w:r>
       <w:r>
         <w:rPr>
-          <w:rFonts w:ascii="Arial" w:hAnsi="Arial"/>
+          <w:rFonts w:ascii="Arial" w:hAnsi="Arial" w:cs="Arial"/>
           <w:b w:val="0"/>
           <w:i w:val="0"/>
+          <w:color w:val="000000"/>
           <w:sz w:val="22"/>
         </w:rPr>
         <w:t xml:space="preserve"> di studio post-production 3U yang menerima </w:t>
       </w:r>
       <w:r>
         <w:rPr>
-          <w:rFonts w:ascii="Arial" w:hAnsi="Arial"/>
+          <w:rFonts w:ascii="Arial" w:hAnsi="Arial" w:cs="Arial"/>
           <w:b w:val="0"/>
           <w:i/>
+          <w:color w:val="000000"/>
           <w:sz w:val="22"/>
         </w:rPr>
         <w:t>raw footage</w:t>
       </w:r>
       <w:r>
         <w:rPr>
-          <w:rFonts w:ascii="Arial" w:hAnsi="Arial"/>
+          <w:rFonts w:ascii="Arial" w:hAnsi="Arial" w:cs="Arial"/>
           <w:b w:val="0"/>
           <w:i w:val="0"/>
+          <w:color w:val="000000"/>
           <w:sz w:val="22"/>
         </w:rPr>
         <w:t xml:space="preserve"> daripada </w:t>
       </w:r>
       <w:r>
         <w:rPr>
-          <w:rFonts w:ascii="Arial" w:hAnsi="Arial"/>
+          <w:rFonts w:ascii="Arial" w:hAnsi="Arial" w:cs="Arial"/>
           <w:b w:val="0"/>
           <w:i/>
+          <w:color w:val="000000"/>
           <w:sz w:val="22"/>
         </w:rPr>
         <w:t>Producer</w:t>
       </w:r>
       <w:r>
         <w:rPr>
-          <w:rFonts w:ascii="Arial" w:hAnsi="Arial"/>
+          <w:rFonts w:ascii="Arial" w:hAnsi="Arial" w:cs="Arial"/>
           <w:b w:val="0"/>
           <w:i w:val="0"/>
+          <w:color w:val="000000"/>
           <w:sz w:val="22"/>
         </w:rPr>
         <w:t xml:space="preserve"> asing perlu menggunakan bahasa kerja yang difahami kedua-dua pihak (contohnya Bahasa Inggeris sebagai bahasa antarabangsa industri kreatif) semasa membincangkan </w:t>
       </w:r>
       <w:r>
         <w:rPr>
-          <w:rFonts w:ascii="Arial" w:hAnsi="Arial"/>
+          <w:rFonts w:ascii="Arial" w:hAnsi="Arial" w:cs="Arial"/>
           <w:b w:val="0"/>
           <w:i/>
+          <w:color w:val="000000"/>
           <w:sz w:val="22"/>
         </w:rPr>
         <w:t>timeline</w:t>
       </w:r>
       <w:r>
         <w:rPr>
-          <w:rFonts w:ascii="Arial" w:hAnsi="Arial"/>
+          <w:rFonts w:ascii="Arial" w:hAnsi="Arial" w:cs="Arial"/>
           <w:b w:val="0"/>
           <w:i w:val="0"/>
+          <w:color w:val="000000"/>
           <w:sz w:val="22"/>
         </w:rPr>
         <w:t xml:space="preserve">, </w:t>
       </w:r>
       <w:r>
         <w:rPr>
-          <w:rFonts w:ascii="Arial" w:hAnsi="Arial"/>
+          <w:rFonts w:ascii="Arial" w:hAnsi="Arial" w:cs="Arial"/>
           <w:b w:val="0"/>
           <w:i/>
+          <w:color w:val="000000"/>
           <w:sz w:val="22"/>
         </w:rPr>
         <w:t>color grading brief</w:t>
       </w:r>
       <w:r>
         <w:rPr>
-          <w:rFonts w:ascii="Arial" w:hAnsi="Arial"/>
+          <w:rFonts w:ascii="Arial" w:hAnsi="Arial" w:cs="Arial"/>
           <w:b w:val="0"/>
           <w:i w:val="0"/>
+          <w:color w:val="000000"/>
           <w:sz w:val="22"/>
         </w:rPr>
         <w:t xml:space="preserve">, dan </w:t>
       </w:r>
       <w:r>
         <w:rPr>
-          <w:rFonts w:ascii="Arial" w:hAnsi="Arial"/>
+          <w:rFonts w:ascii="Arial" w:hAnsi="Arial" w:cs="Arial"/>
           <w:b w:val="0"/>
           <w:i/>
+          <w:color w:val="000000"/>
           <w:sz w:val="22"/>
         </w:rPr>
         <w:t>deadline siaran</w:t>
       </w:r>
       <w:r>
         <w:rPr>
-          <w:rFonts w:ascii="Arial" w:hAnsi="Arial"/>
+          <w:rFonts w:ascii="Arial" w:hAnsi="Arial" w:cs="Arial"/>
           <w:b w:val="0"/>
           <w:i w:val="0"/>
+          <w:color w:val="000000"/>
           <w:sz w:val="22"/>
         </w:rPr>
         <w:t xml:space="preserve"> — kekeliruan bahasa boleh menyebabkan versi </w:t>
       </w:r>
       <w:r>
         <w:rPr>
-          <w:rFonts w:ascii="Arial" w:hAnsi="Arial"/>
+          <w:rFonts w:ascii="Arial" w:hAnsi="Arial" w:cs="Arial"/>
           <w:b w:val="0"/>
           <w:i/>
+          <w:color w:val="000000"/>
           <w:sz w:val="22"/>
         </w:rPr>
         <w:t>cut</w:t>
       </w:r>
       <w:r>
         <w:rPr>
-          <w:rFonts w:ascii="Arial" w:hAnsi="Arial"/>
+          <w:rFonts w:ascii="Arial" w:hAnsi="Arial" w:cs="Arial"/>
           <w:b w:val="0"/>
           <w:i w:val="0"/>
+          <w:color w:val="000000"/>
           <w:sz w:val="22"/>
         </w:rPr>
         <w:t xml:space="preserve"> yang salah dihantar kepada klien.</w:t>
@@ -346,40 +1002,45 @@
     </w:p>
     <w:p>
       <w:pPr>
-        <w:spacing w:after="160"/>
+        <w:spacing w:after="120" w:line="276" w:lineRule="auto"/>
+        <w:jc w:val="left"/>
       </w:pPr>
       <w:r>
         <w:rPr>
-          <w:rFonts w:ascii="Arial" w:hAnsi="Arial"/>
+          <w:rFonts w:ascii="Arial" w:hAnsi="Arial" w:cs="Arial"/>
           <w:b/>
           <w:i w:val="0"/>
+          <w:color w:val="000000"/>
           <w:sz w:val="22"/>
         </w:rPr>
         <w:t>1.2</w:t>
       </w:r>
       <w:r>
         <w:rPr>
-          <w:rFonts w:ascii="Arial" w:hAnsi="Arial"/>
+          <w:rFonts w:ascii="Arial" w:hAnsi="Arial" w:cs="Arial"/>
           <w:b w:val="0"/>
           <w:i w:val="0"/>
+          <w:color w:val="000000"/>
           <w:sz w:val="22"/>
         </w:rPr>
         <w:t xml:space="preserve"> Bahasa kerja </w:t>
       </w:r>
       <w:r>
         <w:rPr>
-          <w:rFonts w:ascii="Arial" w:hAnsi="Arial"/>
+          <w:rFonts w:ascii="Arial" w:hAnsi="Arial" w:cs="Arial"/>
           <w:b w:val="0"/>
           <w:i/>
+          <w:color w:val="000000"/>
           <w:sz w:val="22"/>
         </w:rPr>
         <w:t>(working language)</w:t>
       </w:r>
       <w:r>
         <w:rPr>
-          <w:rFonts w:ascii="Arial" w:hAnsi="Arial"/>
+          <w:rFonts w:ascii="Arial" w:hAnsi="Arial" w:cs="Arial"/>
           <w:b w:val="0"/>
           <w:i w:val="0"/>
+          <w:color w:val="000000"/>
           <w:sz w:val="22"/>
         </w:rPr>
         <w:t xml:space="preserve"> boleh ditakrifkan sebagai bahasa yang digunakan dalam sesebuah syarikat, negeri, masyarakat atau organisasi sebagai alat komunikasi. Bahasa ini penting terutamanya dalam organisasi yang terdiri daripada ahli pelbagai latar belakang bahasa, bagi memastikan tiada kesilapan komunikasi.</w:t>
@@ -387,22 +1048,25 @@
     </w:p>
     <w:p>
       <w:pPr>
-        <w:spacing w:after="160"/>
+        <w:spacing w:after="120" w:line="276" w:lineRule="auto"/>
+        <w:jc w:val="left"/>
       </w:pPr>
       <w:r>
         <w:rPr>
-          <w:rFonts w:ascii="Arial" w:hAnsi="Arial"/>
+          <w:rFonts w:ascii="Arial" w:hAnsi="Arial" w:cs="Arial"/>
           <w:b/>
           <w:i w:val="0"/>
+          <w:color w:val="000000"/>
           <w:sz w:val="22"/>
         </w:rPr>
         <w:t>1.3</w:t>
       </w:r>
       <w:r>
         <w:rPr>
-          <w:rFonts w:ascii="Arial" w:hAnsi="Arial"/>
+          <w:rFonts w:ascii="Arial" w:hAnsi="Arial" w:cs="Arial"/>
           <w:b w:val="0"/>
           <w:i w:val="0"/>
+          <w:color w:val="000000"/>
           <w:sz w:val="22"/>
         </w:rPr>
         <w:t xml:space="preserve"> Sebab utama sesuatu organisasi menetapkan bahasa kerja adalah faktor ekonomi — kos menterjemah semua ucapan, kertas kerja, keputusan dan memo ke dalam setiap bahasa adalah tinggi. Walau bagaimanapun, pemilihan bahasa yang diterima pakai selalunya bergantung kepada penutur asli bahasa tersebut. Bahasa Inggeris, Perancis, Sepanyol dan Jerman adalah bahasa kerja paling lazim bagi banyak badan antarabangsa. Namun, bahasa kerja bergantung kepada kawasan dan jenis organisasi. Jika mereka tidak biasa dengan bahasa tempatan, perkhidmatan jurubahasa disediakan.</w:t>
@@ -410,94 +1074,105 @@
     </w:p>
     <w:p>
       <w:pPr>
-        <w:spacing w:after="160"/>
+        <w:spacing w:after="120" w:line="276" w:lineRule="auto"/>
+        <w:jc w:val="left"/>
       </w:pPr>
       <w:r>
         <w:rPr>
-          <w:rFonts w:ascii="Arial" w:hAnsi="Arial"/>
+          <w:rFonts w:ascii="Arial" w:hAnsi="Arial" w:cs="Arial"/>
           <w:b w:val="0"/>
           <w:i/>
+          <w:color w:val="000000"/>
           <w:sz w:val="22"/>
         </w:rPr>
         <w:t>Contoh studio:</w:t>
       </w:r>
       <w:r>
         <w:rPr>
-          <w:rFonts w:ascii="Arial" w:hAnsi="Arial"/>
+          <w:rFonts w:ascii="Arial" w:hAnsi="Arial" w:cs="Arial"/>
           <w:b w:val="0"/>
           <w:i w:val="0"/>
+          <w:color w:val="000000"/>
           <w:sz w:val="22"/>
         </w:rPr>
         <w:t xml:space="preserve"> dalam pasukan penerbitan video 3U yang mempunyai </w:t>
       </w:r>
       <w:r>
         <w:rPr>
-          <w:rFonts w:ascii="Arial" w:hAnsi="Arial"/>
+          <w:rFonts w:ascii="Arial" w:hAnsi="Arial" w:cs="Arial"/>
           <w:b w:val="0"/>
           <w:i/>
+          <w:color w:val="000000"/>
           <w:sz w:val="22"/>
         </w:rPr>
         <w:t>Editor</w:t>
       </w:r>
       <w:r>
         <w:rPr>
-          <w:rFonts w:ascii="Arial" w:hAnsi="Arial"/>
+          <w:rFonts w:ascii="Arial" w:hAnsi="Arial" w:cs="Arial"/>
           <w:b w:val="0"/>
           <w:i w:val="0"/>
+          <w:color w:val="000000"/>
           <w:sz w:val="22"/>
         </w:rPr>
         <w:t xml:space="preserve"> tempatan dan </w:t>
       </w:r>
       <w:r>
         <w:rPr>
-          <w:rFonts w:ascii="Arial" w:hAnsi="Arial"/>
+          <w:rFonts w:ascii="Arial" w:hAnsi="Arial" w:cs="Arial"/>
           <w:b w:val="0"/>
           <w:i/>
+          <w:color w:val="000000"/>
           <w:sz w:val="22"/>
         </w:rPr>
         <w:t>Director</w:t>
       </w:r>
       <w:r>
         <w:rPr>
-          <w:rFonts w:ascii="Arial" w:hAnsi="Arial"/>
+          <w:rFonts w:ascii="Arial" w:hAnsi="Arial" w:cs="Arial"/>
           <w:b w:val="0"/>
           <w:i w:val="0"/>
+          <w:color w:val="000000"/>
           <w:sz w:val="22"/>
         </w:rPr>
         <w:t xml:space="preserve"> dari luar negara, Bahasa Inggeris digunakan sebagai bahasa perantaraan semasa </w:t>
       </w:r>
       <w:r>
         <w:rPr>
-          <w:rFonts w:ascii="Arial" w:hAnsi="Arial"/>
+          <w:rFonts w:ascii="Arial" w:hAnsi="Arial" w:cs="Arial"/>
           <w:b w:val="0"/>
           <w:i/>
+          <w:color w:val="000000"/>
           <w:sz w:val="22"/>
         </w:rPr>
         <w:t>review session</w:t>
       </w:r>
       <w:r>
         <w:rPr>
-          <w:rFonts w:ascii="Arial" w:hAnsi="Arial"/>
+          <w:rFonts w:ascii="Arial" w:hAnsi="Arial" w:cs="Arial"/>
           <w:b w:val="0"/>
           <w:i w:val="0"/>
+          <w:color w:val="000000"/>
           <w:sz w:val="22"/>
         </w:rPr>
         <w:t xml:space="preserve"> di </w:t>
       </w:r>
       <w:r>
         <w:rPr>
-          <w:rFonts w:ascii="Arial" w:hAnsi="Arial"/>
+          <w:rFonts w:ascii="Arial" w:hAnsi="Arial" w:cs="Arial"/>
           <w:b w:val="0"/>
           <w:i/>
+          <w:color w:val="000000"/>
           <w:sz w:val="22"/>
         </w:rPr>
         <w:t>editing suite</w:t>
       </w:r>
       <w:r>
         <w:rPr>
-          <w:rFonts w:ascii="Arial" w:hAnsi="Arial"/>
+          <w:rFonts w:ascii="Arial" w:hAnsi="Arial" w:cs="Arial"/>
           <w:b w:val="0"/>
           <w:i w:val="0"/>
+          <w:color w:val="000000"/>
           <w:sz w:val="22"/>
         </w:rPr>
         <w:t>, manakala arahan harian dalaman kekal dalam Bahasa Malaysia.</w:t>
@@ -505,22 +1180,25 @@
     </w:p>
     <w:p>
       <w:pPr>
-        <w:spacing w:after="160"/>
+        <w:spacing w:after="120" w:line="276" w:lineRule="auto"/>
+        <w:jc w:val="left"/>
       </w:pPr>
       <w:r>
         <w:rPr>
-          <w:rFonts w:ascii="Arial" w:hAnsi="Arial"/>
+          <w:rFonts w:ascii="Arial" w:hAnsi="Arial" w:cs="Arial"/>
           <w:b/>
           <w:i w:val="0"/>
+          <w:color w:val="000000"/>
           <w:sz w:val="22"/>
         </w:rPr>
         <w:t>1.4</w:t>
       </w:r>
       <w:r>
         <w:rPr>
-          <w:rFonts w:ascii="Arial" w:hAnsi="Arial"/>
+          <w:rFonts w:ascii="Arial" w:hAnsi="Arial" w:cs="Arial"/>
           <w:b w:val="0"/>
           <w:i w:val="0"/>
+          <w:color w:val="000000"/>
           <w:sz w:val="22"/>
         </w:rPr>
         <w:t xml:space="preserve"> Dalam kerja harian, semua pekerja perlu bekerjasama menyelesaikan tugasan syarikat. Adalah penting mereka saling memahami. Jika tidak, salah faham berkaitan prestasi kerja boleh membawa kepada kemalangan. Perkara yang sama berlaku dalam senario yang penting dari segi keselamatan — adalah penting semua orang saling memahami. Bagi memastikan semua pekerja memahami arahan dan tanggungjawab kerja berkaitan tugas mereka, syarikat perlu mewujudkan garis panduan kerja dalam satu bahasa kerja. Bahasa pekerjaan perlu dikenal pasti untuk komunikasi daripada peringkat bawahan ke peringkat atasan organisasi supaya semua aktiviti jabatan dapat berjalan lancar.</w:t>
@@ -528,112 +1206,125 @@
     </w:p>
     <w:p>
       <w:pPr>
-        <w:spacing w:after="160"/>
+        <w:spacing w:after="120" w:line="276" w:lineRule="auto"/>
+        <w:jc w:val="left"/>
       </w:pPr>
       <w:r>
         <w:rPr>
-          <w:rFonts w:ascii="Arial" w:hAnsi="Arial"/>
+          <w:rFonts w:ascii="Arial" w:hAnsi="Arial" w:cs="Arial"/>
           <w:b w:val="0"/>
           <w:i/>
+          <w:color w:val="000000"/>
           <w:sz w:val="22"/>
         </w:rPr>
         <w:t>Contoh studio:</w:t>
       </w:r>
       <w:r>
         <w:rPr>
-          <w:rFonts w:ascii="Arial" w:hAnsi="Arial"/>
+          <w:rFonts w:ascii="Arial" w:hAnsi="Arial" w:cs="Arial"/>
           <w:b w:val="0"/>
           <w:i w:val="0"/>
+          <w:color w:val="000000"/>
           <w:sz w:val="22"/>
         </w:rPr>
         <w:t xml:space="preserve"> arahan keselamatan elektrik di </w:t>
       </w:r>
       <w:r>
         <w:rPr>
-          <w:rFonts w:ascii="Arial" w:hAnsi="Arial"/>
+          <w:rFonts w:ascii="Arial" w:hAnsi="Arial" w:cs="Arial"/>
           <w:b w:val="0"/>
           <w:i/>
+          <w:color w:val="000000"/>
           <w:sz w:val="22"/>
         </w:rPr>
         <w:t>editing suite</w:t>
       </w:r>
       <w:r>
         <w:rPr>
-          <w:rFonts w:ascii="Arial" w:hAnsi="Arial"/>
+          <w:rFonts w:ascii="Arial" w:hAnsi="Arial" w:cs="Arial"/>
           <w:b w:val="0"/>
           <w:i w:val="0"/>
+          <w:color w:val="000000"/>
           <w:sz w:val="22"/>
         </w:rPr>
         <w:t xml:space="preserve"> (contohnya cara mengendalikan kabel kuasa </w:t>
       </w:r>
       <w:r>
         <w:rPr>
-          <w:rFonts w:ascii="Arial" w:hAnsi="Arial"/>
+          <w:rFonts w:ascii="Arial" w:hAnsi="Arial" w:cs="Arial"/>
           <w:b w:val="0"/>
           <w:i/>
+          <w:color w:val="000000"/>
           <w:sz w:val="22"/>
         </w:rPr>
         <w:t>render farm</w:t>
       </w:r>
       <w:r>
         <w:rPr>
-          <w:rFonts w:ascii="Arial" w:hAnsi="Arial"/>
+          <w:rFonts w:ascii="Arial" w:hAnsi="Arial" w:cs="Arial"/>
           <w:b w:val="0"/>
           <w:i w:val="0"/>
+          <w:color w:val="000000"/>
           <w:sz w:val="22"/>
         </w:rPr>
         <w:t xml:space="preserve"> atau </w:t>
       </w:r>
       <w:r>
         <w:rPr>
-          <w:rFonts w:ascii="Arial" w:hAnsi="Arial"/>
+          <w:rFonts w:ascii="Arial" w:hAnsi="Arial" w:cs="Arial"/>
           <w:b w:val="0"/>
           <w:i/>
+          <w:color w:val="000000"/>
           <w:sz w:val="22"/>
         </w:rPr>
         <w:t>UPS</w:t>
       </w:r>
       <w:r>
         <w:rPr>
-          <w:rFonts w:ascii="Arial" w:hAnsi="Arial"/>
+          <w:rFonts w:ascii="Arial" w:hAnsi="Arial" w:cs="Arial"/>
           <w:b w:val="0"/>
           <w:i w:val="0"/>
+          <w:color w:val="000000"/>
           <w:sz w:val="22"/>
         </w:rPr>
         <w:t xml:space="preserve">) perlu ditulis dalam bahasa kerja yang jelas difahami semua </w:t>
       </w:r>
       <w:r>
         <w:rPr>
-          <w:rFonts w:ascii="Arial" w:hAnsi="Arial"/>
+          <w:rFonts w:ascii="Arial" w:hAnsi="Arial" w:cs="Arial"/>
           <w:b w:val="0"/>
           <w:i/>
+          <w:color w:val="000000"/>
           <w:sz w:val="22"/>
         </w:rPr>
         <w:t>Junior Editor</w:t>
       </w:r>
       <w:r>
         <w:rPr>
-          <w:rFonts w:ascii="Arial" w:hAnsi="Arial"/>
+          <w:rFonts w:ascii="Arial" w:hAnsi="Arial" w:cs="Arial"/>
           <w:b w:val="0"/>
           <w:i w:val="0"/>
+          <w:color w:val="000000"/>
           <w:sz w:val="22"/>
         </w:rPr>
         <w:t xml:space="preserve"> dan </w:t>
       </w:r>
       <w:r>
         <w:rPr>
-          <w:rFonts w:ascii="Arial" w:hAnsi="Arial"/>
+          <w:rFonts w:ascii="Arial" w:hAnsi="Arial" w:cs="Arial"/>
           <w:b w:val="0"/>
           <w:i/>
+          <w:color w:val="000000"/>
           <w:sz w:val="22"/>
         </w:rPr>
         <w:t>Assistant Editor</w:t>
       </w:r>
       <w:r>
         <w:rPr>
-          <w:rFonts w:ascii="Arial" w:hAnsi="Arial"/>
+          <w:rFonts w:ascii="Arial" w:hAnsi="Arial" w:cs="Arial"/>
           <w:b w:val="0"/>
           <w:i w:val="0"/>
+          <w:color w:val="000000"/>
           <w:sz w:val="22"/>
         </w:rPr>
         <w:t xml:space="preserve"> — salah faham arahan boleh membawa kepada risiko tersandung kabel atau kerosakan peralatan.</w:t>
@@ -641,22 +1332,25 @@
     </w:p>
     <w:p>
       <w:pPr>
-        <w:spacing w:after="160"/>
+        <w:spacing w:after="120" w:line="276" w:lineRule="auto"/>
+        <w:jc w:val="left"/>
       </w:pPr>
       <w:r>
         <w:rPr>
-          <w:rFonts w:ascii="Arial" w:hAnsi="Arial"/>
+          <w:rFonts w:ascii="Arial" w:hAnsi="Arial" w:cs="Arial"/>
           <w:b/>
           <w:i w:val="0"/>
+          <w:color w:val="000000"/>
           <w:sz w:val="22"/>
         </w:rPr>
         <w:t>1.5</w:t>
       </w:r>
       <w:r>
         <w:rPr>
-          <w:rFonts w:ascii="Arial" w:hAnsi="Arial"/>
+          <w:rFonts w:ascii="Arial" w:hAnsi="Arial" w:cs="Arial"/>
           <w:b w:val="0"/>
           <w:i w:val="0"/>
+          <w:color w:val="000000"/>
           <w:sz w:val="22"/>
         </w:rPr>
         <w:t xml:space="preserve"> Dalam amalan organisasi yang mempunyai pekerja asing seperti di Malaysia, Bahasa Malaysia menjadi bahasa kerja utama di tempat kerja kerana ia adalah bahasa rasmi dalam urusan dengan kerajaan serta ucapan asas yang diajar kepada pekerja bawahan. Manakala Bahasa Inggeris menjadi bahasa kedua sebagai bahan rujukan kerja, penerangan hal luar negara dan hubungan bahasa dengan organisasi asing.</w:t>
@@ -664,45 +1358,51 @@
     </w:p>
     <w:p>
       <w:pPr>
-        <w:spacing w:before="200"/>
+        <w:spacing w:before="120" w:after="120" w:line="276" w:lineRule="auto"/>
+        <w:jc w:val="left"/>
       </w:pPr>
       <w:r>
         <w:rPr>
-          <w:rFonts w:ascii="Arial" w:hAnsi="Arial"/>
+          <w:rFonts w:ascii="Arial" w:hAnsi="Arial" w:cs="Arial"/>
           <w:b/>
           <w:i w:val="0"/>
-          <w:sz w:val="24"/>
+          <w:color w:val="000000"/>
+          <w:sz w:val="22"/>
         </w:rPr>
         <w:t xml:space="preserve">2. Language At Work </w:t>
       </w:r>
       <w:r>
         <w:rPr>
-          <w:rFonts w:ascii="Arial" w:hAnsi="Arial"/>
+          <w:rFonts w:ascii="Arial" w:hAnsi="Arial" w:cs="Arial"/>
           <w:b/>
           <w:i/>
-          <w:sz w:val="24"/>
+          <w:color w:val="000000"/>
+          <w:sz w:val="22"/>
         </w:rPr>
         <w:t>(Bahasa Di Tempat Kerja)</w:t>
       </w:r>
     </w:p>
     <w:p>
       <w:pPr>
-        <w:spacing w:after="160"/>
+        <w:spacing w:after="120" w:line="276" w:lineRule="auto"/>
+        <w:jc w:val="left"/>
       </w:pPr>
       <w:r>
         <w:rPr>
-          <w:rFonts w:ascii="Arial" w:hAnsi="Arial"/>
+          <w:rFonts w:ascii="Arial" w:hAnsi="Arial" w:cs="Arial"/>
           <w:b/>
           <w:i w:val="0"/>
+          <w:color w:val="000000"/>
           <w:sz w:val="22"/>
         </w:rPr>
         <w:t>2.1</w:t>
       </w:r>
       <w:r>
         <w:rPr>
-          <w:rFonts w:ascii="Arial" w:hAnsi="Arial"/>
+          <w:rFonts w:ascii="Arial" w:hAnsi="Arial" w:cs="Arial"/>
           <w:b w:val="0"/>
           <w:i w:val="0"/>
+          <w:color w:val="000000"/>
           <w:sz w:val="22"/>
         </w:rPr>
         <w:t xml:space="preserve"> Gunakan bahasa piawai dan ikut peraturan tatabahasa yang ditetapkan. Di tempat kerja, anda perlu sentiasa menggunakan bahasa piawai dalam pertuturan dan penulisan. Jika anda berasal daripada kawasan yang biasa menggunakan Bahasa Inggeris bukan piawai dan anda sendiri menggunakannya, buatlah usaha sedar untuk bertutur dalam Bahasa Inggeris piawai dan bertatabahasa. Perhatikan cara profesional lain bertutur dan menulis di tempat kerja, dan anda akan mula menyedari cara untuk memperbaiki pertuturan dan penulisan anda sendiri.</w:t>
@@ -710,22 +1410,25 @@
     </w:p>
     <w:p>
       <w:pPr>
-        <w:spacing w:after="160"/>
+        <w:spacing w:after="120" w:line="276" w:lineRule="auto"/>
+        <w:jc w:val="left"/>
       </w:pPr>
       <w:r>
         <w:rPr>
-          <w:rFonts w:ascii="Arial" w:hAnsi="Arial"/>
+          <w:rFonts w:ascii="Arial" w:hAnsi="Arial" w:cs="Arial"/>
           <w:b/>
           <w:i w:val="0"/>
+          <w:color w:val="000000"/>
           <w:sz w:val="22"/>
         </w:rPr>
         <w:t>2.2</w:t>
       </w:r>
       <w:r>
         <w:rPr>
-          <w:rFonts w:ascii="Arial" w:hAnsi="Arial"/>
+          <w:rFonts w:ascii="Arial" w:hAnsi="Arial" w:cs="Arial"/>
           <w:b w:val="0"/>
           <w:i w:val="0"/>
+          <w:color w:val="000000"/>
           <w:sz w:val="22"/>
         </w:rPr>
         <w:t xml:space="preserve"> Gunakan tahap keformalan yang sesuai. Semasa berbual dalam situasi kurang formal atau menulis surat-menyurat kurang formal, anda boleh menggunakan Bahasa Inggeris yang kurang formal, tetapi kekal hormat dan profesional pada setiap masa.</w:t>
@@ -733,22 +1436,25 @@
     </w:p>
     <w:p>
       <w:pPr>
-        <w:spacing w:after="160"/>
+        <w:spacing w:after="120" w:line="276" w:lineRule="auto"/>
+        <w:jc w:val="left"/>
       </w:pPr>
       <w:r>
         <w:rPr>
-          <w:rFonts w:ascii="Arial" w:hAnsi="Arial"/>
+          <w:rFonts w:ascii="Arial" w:hAnsi="Arial" w:cs="Arial"/>
           <w:b/>
           <w:i w:val="0"/>
+          <w:color w:val="000000"/>
           <w:sz w:val="22"/>
         </w:rPr>
         <w:t>2.3</w:t>
       </w:r>
       <w:r>
         <w:rPr>
-          <w:rFonts w:ascii="Arial" w:hAnsi="Arial"/>
+          <w:rFonts w:ascii="Arial" w:hAnsi="Arial" w:cs="Arial"/>
           <w:b w:val="0"/>
           <w:i w:val="0"/>
+          <w:color w:val="000000"/>
           <w:sz w:val="22"/>
         </w:rPr>
         <w:t xml:space="preserve"> Jangan gunakan bahasa lucah. Mengumpat tidak boleh diterima di tempat kerja.</w:t>
@@ -756,22 +1462,25 @@
     </w:p>
     <w:p>
       <w:pPr>
-        <w:spacing w:after="160"/>
+        <w:spacing w:after="120" w:line="276" w:lineRule="auto"/>
+        <w:jc w:val="left"/>
       </w:pPr>
       <w:r>
         <w:rPr>
-          <w:rFonts w:ascii="Arial" w:hAnsi="Arial"/>
+          <w:rFonts w:ascii="Arial" w:hAnsi="Arial" w:cs="Arial"/>
           <w:b/>
           <w:i w:val="0"/>
+          <w:color w:val="000000"/>
           <w:sz w:val="22"/>
         </w:rPr>
         <w:t>2.4</w:t>
       </w:r>
       <w:r>
         <w:rPr>
-          <w:rFonts w:ascii="Arial" w:hAnsi="Arial"/>
+          <w:rFonts w:ascii="Arial" w:hAnsi="Arial" w:cs="Arial"/>
           <w:b w:val="0"/>
           <w:i w:val="0"/>
+          <w:color w:val="000000"/>
           <w:sz w:val="22"/>
         </w:rPr>
         <w:t xml:space="preserve"> Elakkan komen berat sebelah atau menghina. Jangan gunakan bahasa kesat atau bahasa yang berat sebelah terhadap mana-mana kumpulan kaum, etnik, agama, umur, atau kumpulan lain. Elakkan komen, generalisasi, contoh, atau jenaka yang mengesahkan atau meneruskan stereotaip negatif.</w:t>
@@ -779,40 +1488,45 @@
     </w:p>
     <w:p>
       <w:pPr>
-        <w:spacing w:after="160"/>
+        <w:spacing w:after="120" w:line="276" w:lineRule="auto"/>
+        <w:jc w:val="left"/>
       </w:pPr>
       <w:r>
         <w:rPr>
-          <w:rFonts w:ascii="Arial" w:hAnsi="Arial"/>
+          <w:rFonts w:ascii="Arial" w:hAnsi="Arial" w:cs="Arial"/>
           <w:b/>
           <w:i w:val="0"/>
+          <w:color w:val="000000"/>
           <w:sz w:val="22"/>
         </w:rPr>
         <w:t>2.5</w:t>
       </w:r>
       <w:r>
         <w:rPr>
-          <w:rFonts w:ascii="Arial" w:hAnsi="Arial"/>
+          <w:rFonts w:ascii="Arial" w:hAnsi="Arial" w:cs="Arial"/>
           <w:b w:val="0"/>
           <w:i w:val="0"/>
+          <w:color w:val="000000"/>
           <w:sz w:val="22"/>
         </w:rPr>
         <w:t xml:space="preserve"> Elakkan bahasa slanga. Anda sepatutnya secara amnya mengelakkan slanga di tempat kerja, walaupun perkataan atau ungkapan yang diterima secara umum dalam suasana lain. Berhati-hati dalam penggunaan ungkapan berbentuk </w:t>
       </w:r>
       <w:r>
         <w:rPr>
-          <w:rFonts w:ascii="Arial" w:hAnsi="Arial"/>
+          <w:rFonts w:ascii="Arial" w:hAnsi="Arial" w:cs="Arial"/>
           <w:b w:val="0"/>
           <w:i/>
+          <w:color w:val="000000"/>
           <w:sz w:val="22"/>
         </w:rPr>
         <w:t>idiomatic</w:t>
       </w:r>
       <w:r>
         <w:rPr>
-          <w:rFonts w:ascii="Arial" w:hAnsi="Arial"/>
+          <w:rFonts w:ascii="Arial" w:hAnsi="Arial" w:cs="Arial"/>
           <w:b w:val="0"/>
           <w:i w:val="0"/>
+          <w:color w:val="000000"/>
           <w:sz w:val="22"/>
         </w:rPr>
         <w:t>, terutamanya bahasa daerah.</w:t>
@@ -820,40 +1534,45 @@
     </w:p>
     <w:p>
       <w:pPr>
-        <w:spacing w:after="160"/>
+        <w:spacing w:after="120" w:line="276" w:lineRule="auto"/>
+        <w:jc w:val="left"/>
       </w:pPr>
       <w:r>
         <w:rPr>
-          <w:rFonts w:ascii="Arial" w:hAnsi="Arial"/>
+          <w:rFonts w:ascii="Arial" w:hAnsi="Arial" w:cs="Arial"/>
           <w:b/>
           <w:i w:val="0"/>
+          <w:color w:val="000000"/>
           <w:sz w:val="22"/>
         </w:rPr>
         <w:t>2.6</w:t>
       </w:r>
       <w:r>
         <w:rPr>
-          <w:rFonts w:ascii="Arial" w:hAnsi="Arial"/>
+          <w:rFonts w:ascii="Arial" w:hAnsi="Arial" w:cs="Arial"/>
           <w:b w:val="0"/>
           <w:i w:val="0"/>
+          <w:color w:val="000000"/>
           <w:sz w:val="22"/>
         </w:rPr>
         <w:t xml:space="preserve"> Berhati-hati apabila menggunakan istilah teknikal </w:t>
       </w:r>
       <w:r>
         <w:rPr>
-          <w:rFonts w:ascii="Arial" w:hAnsi="Arial"/>
+          <w:rFonts w:ascii="Arial" w:hAnsi="Arial" w:cs="Arial"/>
           <w:b w:val="0"/>
           <w:i/>
+          <w:color w:val="000000"/>
           <w:sz w:val="22"/>
         </w:rPr>
         <w:t>(jargon)</w:t>
       </w:r>
       <w:r>
         <w:rPr>
-          <w:rFonts w:ascii="Arial" w:hAnsi="Arial"/>
+          <w:rFonts w:ascii="Arial" w:hAnsi="Arial" w:cs="Arial"/>
           <w:b w:val="0"/>
           <w:i w:val="0"/>
+          <w:color w:val="000000"/>
           <w:sz w:val="22"/>
         </w:rPr>
         <w:t>. Jargon perlu digunakan dengan berhemat, dan hanya apabila bercakap atau menulis kepada pihak yang biasa dengan istilah yang digunakan. Jika anda rasa perlu menggunakan jargon untuk khalayak umum, pastikan anda menerangkan maksud istilah tersebut.</w:t>
@@ -861,130 +1580,145 @@
     </w:p>
     <w:p>
       <w:pPr>
-        <w:spacing w:after="160"/>
+        <w:spacing w:after="120" w:line="276" w:lineRule="auto"/>
+        <w:jc w:val="left"/>
       </w:pPr>
       <w:r>
         <w:rPr>
-          <w:rFonts w:ascii="Arial" w:hAnsi="Arial"/>
+          <w:rFonts w:ascii="Arial" w:hAnsi="Arial" w:cs="Arial"/>
           <w:b w:val="0"/>
           <w:i/>
+          <w:color w:val="000000"/>
           <w:sz w:val="22"/>
         </w:rPr>
         <w:t>Contoh studio:</w:t>
       </w:r>
       <w:r>
         <w:rPr>
-          <w:rFonts w:ascii="Arial" w:hAnsi="Arial"/>
+          <w:rFonts w:ascii="Arial" w:hAnsi="Arial" w:cs="Arial"/>
           <w:b w:val="0"/>
           <w:i w:val="0"/>
+          <w:color w:val="000000"/>
           <w:sz w:val="22"/>
         </w:rPr>
         <w:t xml:space="preserve"> apabila seorang </w:t>
       </w:r>
       <w:r>
         <w:rPr>
-          <w:rFonts w:ascii="Arial" w:hAnsi="Arial"/>
+          <w:rFonts w:ascii="Arial" w:hAnsi="Arial" w:cs="Arial"/>
           <w:b w:val="0"/>
           <w:i/>
+          <w:color w:val="000000"/>
           <w:sz w:val="22"/>
         </w:rPr>
         <w:t>Editor</w:t>
       </w:r>
       <w:r>
         <w:rPr>
-          <w:rFonts w:ascii="Arial" w:hAnsi="Arial"/>
+          <w:rFonts w:ascii="Arial" w:hAnsi="Arial" w:cs="Arial"/>
           <w:b w:val="0"/>
           <w:i w:val="0"/>
+          <w:color w:val="000000"/>
           <w:sz w:val="22"/>
         </w:rPr>
         <w:t xml:space="preserve"> menerangkan proses </w:t>
       </w:r>
       <w:r>
         <w:rPr>
-          <w:rFonts w:ascii="Arial" w:hAnsi="Arial"/>
+          <w:rFonts w:ascii="Arial" w:hAnsi="Arial" w:cs="Arial"/>
           <w:b w:val="0"/>
           <w:i/>
+          <w:color w:val="000000"/>
           <w:sz w:val="22"/>
         </w:rPr>
         <w:t>rendering</w:t>
       </w:r>
       <w:r>
         <w:rPr>
-          <w:rFonts w:ascii="Arial" w:hAnsi="Arial"/>
+          <w:rFonts w:ascii="Arial" w:hAnsi="Arial" w:cs="Arial"/>
           <w:b w:val="0"/>
           <w:i w:val="0"/>
+          <w:color w:val="000000"/>
           <w:sz w:val="22"/>
         </w:rPr>
         <w:t xml:space="preserve"> atau </w:t>
       </w:r>
       <w:r>
         <w:rPr>
-          <w:rFonts w:ascii="Arial" w:hAnsi="Arial"/>
+          <w:rFonts w:ascii="Arial" w:hAnsi="Arial" w:cs="Arial"/>
           <w:b w:val="0"/>
           <w:i/>
+          <w:color w:val="000000"/>
           <w:sz w:val="22"/>
         </w:rPr>
         <w:t>color correction</w:t>
       </w:r>
       <w:r>
         <w:rPr>
-          <w:rFonts w:ascii="Arial" w:hAnsi="Arial"/>
+          <w:rFonts w:ascii="Arial" w:hAnsi="Arial" w:cs="Arial"/>
           <w:b w:val="0"/>
           <w:i w:val="0"/>
+          <w:color w:val="000000"/>
           <w:sz w:val="22"/>
         </w:rPr>
         <w:t xml:space="preserve"> kepada klien yang bukan dari industri media, istilah teknikal seperti </w:t>
       </w:r>
       <w:r>
         <w:rPr>
-          <w:rFonts w:ascii="Arial" w:hAnsi="Arial"/>
+          <w:rFonts w:ascii="Arial" w:hAnsi="Arial" w:cs="Arial"/>
           <w:b w:val="0"/>
           <w:i/>
+          <w:color w:val="000000"/>
           <w:sz w:val="22"/>
         </w:rPr>
         <w:t>"timeline"</w:t>
       </w:r>
       <w:r>
         <w:rPr>
-          <w:rFonts w:ascii="Arial" w:hAnsi="Arial"/>
+          <w:rFonts w:ascii="Arial" w:hAnsi="Arial" w:cs="Arial"/>
           <w:b w:val="0"/>
           <w:i w:val="0"/>
+          <w:color w:val="000000"/>
           <w:sz w:val="22"/>
         </w:rPr>
         <w:t xml:space="preserve">, </w:t>
       </w:r>
       <w:r>
         <w:rPr>
-          <w:rFonts w:ascii="Arial" w:hAnsi="Arial"/>
+          <w:rFonts w:ascii="Arial" w:hAnsi="Arial" w:cs="Arial"/>
           <w:b w:val="0"/>
           <w:i/>
+          <w:color w:val="000000"/>
           <w:sz w:val="22"/>
         </w:rPr>
         <w:t>"proxy footage"</w:t>
       </w:r>
       <w:r>
         <w:rPr>
-          <w:rFonts w:ascii="Arial" w:hAnsi="Arial"/>
+          <w:rFonts w:ascii="Arial" w:hAnsi="Arial" w:cs="Arial"/>
           <w:b w:val="0"/>
           <w:i w:val="0"/>
+          <w:color w:val="000000"/>
           <w:sz w:val="22"/>
         </w:rPr>
         <w:t xml:space="preserve">, atau </w:t>
       </w:r>
       <w:r>
         <w:rPr>
-          <w:rFonts w:ascii="Arial" w:hAnsi="Arial"/>
+          <w:rFonts w:ascii="Arial" w:hAnsi="Arial" w:cs="Arial"/>
           <w:b w:val="0"/>
           <w:i/>
+          <w:color w:val="000000"/>
           <w:sz w:val="22"/>
         </w:rPr>
         <w:t>"colour grading"</w:t>
       </w:r>
       <w:r>
         <w:rPr>
-          <w:rFonts w:ascii="Arial" w:hAnsi="Arial"/>
+          <w:rFonts w:ascii="Arial" w:hAnsi="Arial" w:cs="Arial"/>
           <w:b w:val="0"/>
           <w:i w:val="0"/>
+          <w:color w:val="000000"/>
           <w:sz w:val="22"/>
         </w:rPr>
         <w:t xml:space="preserve"> perlu diterangkan dengan ringkas dahulu supaya klien memahami status kerja.</w:t>
@@ -992,22 +1726,25 @@
     </w:p>
     <w:p>
       <w:pPr>
-        <w:spacing w:after="160"/>
+        <w:spacing w:after="120" w:line="276" w:lineRule="auto"/>
+        <w:jc w:val="left"/>
       </w:pPr>
       <w:r>
         <w:rPr>
-          <w:rFonts w:ascii="Arial" w:hAnsi="Arial"/>
+          <w:rFonts w:ascii="Arial" w:hAnsi="Arial" w:cs="Arial"/>
           <w:b/>
           <w:i w:val="0"/>
+          <w:color w:val="000000"/>
           <w:sz w:val="22"/>
         </w:rPr>
         <w:t>2.7</w:t>
       </w:r>
       <w:r>
         <w:rPr>
-          <w:rFonts w:ascii="Arial" w:hAnsi="Arial"/>
+          <w:rFonts w:ascii="Arial" w:hAnsi="Arial" w:cs="Arial"/>
           <w:b w:val="0"/>
           <w:i w:val="0"/>
+          <w:color w:val="000000"/>
           <w:sz w:val="22"/>
         </w:rPr>
         <w:t xml:space="preserve"> Bersopan santun. Anda akan dapat mencapai lebih banyak dan sudah tentu mempunyai hubungan lebih baik dengan rakan sekerja jika anda melayan mereka dengan hormat dan menunjukkan penghargaan tulus menggunakan kata-kata sopan.</w:t>
@@ -1015,22 +1752,25 @@
     </w:p>
     <w:p>
       <w:pPr>
-        <w:spacing w:after="160"/>
+        <w:spacing w:after="120" w:line="276" w:lineRule="auto"/>
+        <w:jc w:val="left"/>
       </w:pPr>
       <w:r>
         <w:rPr>
-          <w:rFonts w:ascii="Arial" w:hAnsi="Arial"/>
+          <w:rFonts w:ascii="Arial" w:hAnsi="Arial" w:cs="Arial"/>
           <w:b/>
           <w:i w:val="0"/>
+          <w:color w:val="000000"/>
           <w:sz w:val="22"/>
         </w:rPr>
         <w:t>2.8</w:t>
       </w:r>
       <w:r>
         <w:rPr>
-          <w:rFonts w:ascii="Arial" w:hAnsi="Arial"/>
+          <w:rFonts w:ascii="Arial" w:hAnsi="Arial" w:cs="Arial"/>
           <w:b w:val="0"/>
           <w:i w:val="0"/>
+          <w:color w:val="000000"/>
           <w:sz w:val="22"/>
         </w:rPr>
         <w:t xml:space="preserve"> Ikuti kelas. Untuk mempelajari lebih lanjut tentang penggunaan bahasa yang sesuai serta penulisan dan pertuturan yang baik di tempat kerja, anda boleh mengikuti kelas atau menghadiri bengkel atau seminar mengenai komunikasi berkesan dalam dunia perniagaan.</w:t>
@@ -1038,45 +1778,51 @@
     </w:p>
     <w:p>
       <w:pPr>
-        <w:spacing w:before="200"/>
+        <w:spacing w:before="120" w:after="120" w:line="276" w:lineRule="auto"/>
+        <w:jc w:val="left"/>
       </w:pPr>
       <w:r>
         <w:rPr>
-          <w:rFonts w:ascii="Arial" w:hAnsi="Arial"/>
+          <w:rFonts w:ascii="Arial" w:hAnsi="Arial" w:cs="Arial"/>
           <w:b/>
           <w:i w:val="0"/>
-          <w:sz w:val="24"/>
+          <w:color w:val="000000"/>
+          <w:sz w:val="22"/>
         </w:rPr>
         <w:t xml:space="preserve">3. Types Of Working Reference Materials </w:t>
       </w:r>
       <w:r>
         <w:rPr>
-          <w:rFonts w:ascii="Arial" w:hAnsi="Arial"/>
+          <w:rFonts w:ascii="Arial" w:hAnsi="Arial" w:cs="Arial"/>
           <w:b/>
           <w:i/>
-          <w:sz w:val="24"/>
+          <w:color w:val="000000"/>
+          <w:sz w:val="22"/>
         </w:rPr>
         <w:t>(Jenis Bahan Rujukan Kerja)</w:t>
       </w:r>
     </w:p>
     <w:p>
       <w:pPr>
-        <w:spacing w:after="160"/>
+        <w:spacing w:after="120" w:line="276" w:lineRule="auto"/>
+        <w:jc w:val="left"/>
       </w:pPr>
       <w:r>
         <w:rPr>
-          <w:rFonts w:ascii="Arial" w:hAnsi="Arial"/>
+          <w:rFonts w:ascii="Arial" w:hAnsi="Arial" w:cs="Arial"/>
           <w:b/>
           <w:i w:val="0"/>
+          <w:color w:val="000000"/>
           <w:sz w:val="22"/>
         </w:rPr>
         <w:t>3.1</w:t>
       </w:r>
       <w:r>
         <w:rPr>
-          <w:rFonts w:ascii="Arial" w:hAnsi="Arial"/>
+          <w:rFonts w:ascii="Arial" w:hAnsi="Arial" w:cs="Arial"/>
           <w:b w:val="0"/>
           <w:i w:val="0"/>
+          <w:color w:val="000000"/>
           <w:sz w:val="22"/>
         </w:rPr>
         <w:t xml:space="preserve"> Bahan rujukan kerja adalah penerangan tugas dan aktiviti khusus dalam sesebuah organisasi. Bahan ini adalah dokumen bertulis atau kenyataan yang menerangkan skop tugas. Ini membantu pekerja lebih fokus dalam kerja berdasarkan skop, persekitaran dan keadaan kerja.</w:t>
@@ -1084,22 +1830,25 @@
     </w:p>
     <w:p>
       <w:pPr>
-        <w:spacing w:after="160"/>
+        <w:spacing w:after="120" w:line="276" w:lineRule="auto"/>
+        <w:jc w:val="left"/>
       </w:pPr>
       <w:r>
         <w:rPr>
-          <w:rFonts w:ascii="Arial" w:hAnsi="Arial"/>
+          <w:rFonts w:ascii="Arial" w:hAnsi="Arial" w:cs="Arial"/>
           <w:b/>
           <w:i w:val="0"/>
+          <w:color w:val="000000"/>
           <w:sz w:val="22"/>
         </w:rPr>
         <w:t>3.2</w:t>
       </w:r>
       <w:r>
         <w:rPr>
-          <w:rFonts w:ascii="Arial" w:hAnsi="Arial"/>
+          <w:rFonts w:ascii="Arial" w:hAnsi="Arial" w:cs="Arial"/>
           <w:b w:val="0"/>
           <w:i w:val="0"/>
+          <w:color w:val="000000"/>
           <w:sz w:val="22"/>
         </w:rPr>
         <w:t xml:space="preserve"> Pada asasnya, terdapat empat (4) bahan rujukan kerja yang biasa digunakan di tempat kerja:</w:t>
@@ -1108,21 +1857,26 @@
     <w:p>
       <w:pPr>
         <w:pStyle w:val="ListBullet"/>
+        <w:spacing w:line="276" w:lineRule="auto" w:after="40"/>
+        <w:ind w:left="357" w:hanging="357"/>
+        <w:jc w:val="left"/>
       </w:pPr>
       <w:r>
         <w:rPr>
-          <w:rFonts w:ascii="Arial" w:hAnsi="Arial"/>
+          <w:rFonts w:ascii="Arial" w:hAnsi="Arial" w:cs="Arial"/>
           <w:b w:val="0"/>
           <w:i w:val="0"/>
+          <w:color w:val="000000"/>
           <w:sz w:val="22"/>
         </w:rPr>
         <w:t xml:space="preserve">i) Garis panduan tanggungjawab kerja </w:t>
       </w:r>
       <w:r>
         <w:rPr>
-          <w:rFonts w:ascii="Arial" w:hAnsi="Arial"/>
+          <w:rFonts w:ascii="Arial" w:hAnsi="Arial" w:cs="Arial"/>
           <w:b w:val="0"/>
           <w:i/>
+          <w:color w:val="000000"/>
           <w:sz w:val="22"/>
         </w:rPr>
         <w:t>(Job responsibility guideline)</w:t>
@@ -1131,21 +1885,26 @@
     <w:p>
       <w:pPr>
         <w:pStyle w:val="ListBullet"/>
+        <w:spacing w:line="276" w:lineRule="auto" w:after="40"/>
+        <w:ind w:left="357" w:hanging="357"/>
+        <w:jc w:val="left"/>
       </w:pPr>
       <w:r>
         <w:rPr>
-          <w:rFonts w:ascii="Arial" w:hAnsi="Arial"/>
+          <w:rFonts w:ascii="Arial" w:hAnsi="Arial" w:cs="Arial"/>
           <w:b w:val="0"/>
           <w:i w:val="0"/>
+          <w:color w:val="000000"/>
           <w:sz w:val="22"/>
         </w:rPr>
         <w:t xml:space="preserve">ii) Prosedur kerja </w:t>
       </w:r>
       <w:r>
         <w:rPr>
-          <w:rFonts w:ascii="Arial" w:hAnsi="Arial"/>
+          <w:rFonts w:ascii="Arial" w:hAnsi="Arial" w:cs="Arial"/>
           <w:b w:val="0"/>
           <w:i/>
+          <w:color w:val="000000"/>
           <w:sz w:val="22"/>
         </w:rPr>
         <w:t>(Job procedure)</w:t>
@@ -1154,21 +1913,26 @@
     <w:p>
       <w:pPr>
         <w:pStyle w:val="ListBullet"/>
+        <w:spacing w:line="276" w:lineRule="auto" w:after="40"/>
+        <w:ind w:left="357" w:hanging="357"/>
+        <w:jc w:val="left"/>
       </w:pPr>
       <w:r>
         <w:rPr>
-          <w:rFonts w:ascii="Arial" w:hAnsi="Arial"/>
+          <w:rFonts w:ascii="Arial" w:hAnsi="Arial" w:cs="Arial"/>
           <w:b w:val="0"/>
           <w:i w:val="0"/>
+          <w:color w:val="000000"/>
           <w:sz w:val="22"/>
         </w:rPr>
         <w:t xml:space="preserve">iii) Tatacara kerja </w:t>
       </w:r>
       <w:r>
         <w:rPr>
-          <w:rFonts w:ascii="Arial" w:hAnsi="Arial"/>
+          <w:rFonts w:ascii="Arial" w:hAnsi="Arial" w:cs="Arial"/>
           <w:b w:val="0"/>
           <w:i/>
+          <w:color w:val="000000"/>
           <w:sz w:val="22"/>
         </w:rPr>
         <w:t>(Working procedure)</w:t>
@@ -1177,21 +1941,26 @@
     <w:p>
       <w:pPr>
         <w:pStyle w:val="ListBullet"/>
+        <w:spacing w:line="276" w:lineRule="auto" w:after="40"/>
+        <w:ind w:left="357" w:hanging="357"/>
+        <w:jc w:val="left"/>
       </w:pPr>
       <w:r>
         <w:rPr>
-          <w:rFonts w:ascii="Arial" w:hAnsi="Arial"/>
+          <w:rFonts w:ascii="Arial" w:hAnsi="Arial" w:cs="Arial"/>
           <w:b w:val="0"/>
           <w:i w:val="0"/>
+          <w:color w:val="000000"/>
           <w:sz w:val="22"/>
         </w:rPr>
         <w:t xml:space="preserve">iv) Arahan kerja </w:t>
       </w:r>
       <w:r>
         <w:rPr>
-          <w:rFonts w:ascii="Arial" w:hAnsi="Arial"/>
+          <w:rFonts w:ascii="Arial" w:hAnsi="Arial" w:cs="Arial"/>
           <w:b w:val="0"/>
           <w:i/>
+          <w:color w:val="000000"/>
           <w:sz w:val="22"/>
         </w:rPr>
         <w:t>(Working instruction)</w:t>
@@ -1199,76 +1968,85 @@
     </w:p>
     <w:p>
       <w:pPr>
-        <w:spacing w:after="160"/>
+        <w:spacing w:after="120" w:line="276" w:lineRule="auto"/>
+        <w:jc w:val="left"/>
       </w:pPr>
       <w:r>
         <w:rPr>
-          <w:rFonts w:ascii="Arial" w:hAnsi="Arial"/>
+          <w:rFonts w:ascii="Arial" w:hAnsi="Arial" w:cs="Arial"/>
           <w:b/>
           <w:i w:val="0"/>
+          <w:color w:val="000000"/>
           <w:sz w:val="22"/>
         </w:rPr>
         <w:t>i) Job responsibility guideline</w:t>
       </w:r>
       <w:r>
         <w:rPr>
-          <w:rFonts w:ascii="Arial" w:hAnsi="Arial"/>
+          <w:rFonts w:ascii="Arial" w:hAnsi="Arial" w:cs="Arial"/>
           <w:b w:val="0"/>
           <w:i w:val="0"/>
+          <w:color w:val="000000"/>
           <w:sz w:val="22"/>
         </w:rPr>
         <w:t xml:space="preserve"> — Tujuan utama huraian kerja </w:t>
       </w:r>
       <w:r>
         <w:rPr>
-          <w:rFonts w:ascii="Arial" w:hAnsi="Arial"/>
+          <w:rFonts w:ascii="Arial" w:hAnsi="Arial" w:cs="Arial"/>
           <w:b w:val="0"/>
           <w:i/>
+          <w:color w:val="000000"/>
           <w:sz w:val="22"/>
         </w:rPr>
         <w:t>(job description)</w:t>
       </w:r>
       <w:r>
         <w:rPr>
-          <w:rFonts w:ascii="Arial" w:hAnsi="Arial"/>
+          <w:rFonts w:ascii="Arial" w:hAnsi="Arial" w:cs="Arial"/>
           <w:b w:val="0"/>
           <w:i w:val="0"/>
+          <w:color w:val="000000"/>
           <w:sz w:val="22"/>
         </w:rPr>
         <w:t xml:space="preserve"> adalah menetapkan dengan jelas dan ringkas tugas dan tanggungjawab pemegang jawatan yang terlibat dalam sesuatu pekerjaan. Sebelum menghurai satu huraian kerja, adalah berguna melalui proses yang dikenali sebagai Analisis Kerja </w:t>
       </w:r>
       <w:r>
         <w:rPr>
-          <w:rFonts w:ascii="Arial" w:hAnsi="Arial"/>
+          <w:rFonts w:ascii="Arial" w:hAnsi="Arial" w:cs="Arial"/>
           <w:b w:val="0"/>
           <w:i/>
+          <w:color w:val="000000"/>
           <w:sz w:val="22"/>
         </w:rPr>
         <w:t>(Job Analysis)</w:t>
       </w:r>
       <w:r>
         <w:rPr>
-          <w:rFonts w:ascii="Arial" w:hAnsi="Arial"/>
+          <w:rFonts w:ascii="Arial" w:hAnsi="Arial" w:cs="Arial"/>
           <w:b w:val="0"/>
           <w:i w:val="0"/>
+          <w:color w:val="000000"/>
           <w:sz w:val="22"/>
         </w:rPr>
         <w:t xml:space="preserve">. Analisis kerja adalah proses mendapatkan maklumat tentang pekerjaan dengan menentukan tugas, aktiviti pekerjaan dan kelayakan pemegang jawatan. Maklumat ini kemudian digunakan untuk membangunkan huraian kerja dan spesifikasi kerja. Dengan membuat analisis kerja, kita akan mengumpulkan maklumat seperti tugas terperinci sesuatu jawatan, tanggungjawab, tempat dan kaedah menjalankan kerja tersebut (rujuk </w:t>
       </w:r>
       <w:r>
         <w:rPr>
-          <w:rFonts w:ascii="Arial" w:hAnsi="Arial"/>
+          <w:rFonts w:ascii="Arial" w:hAnsi="Arial" w:cs="Arial"/>
           <w:b w:val="0"/>
           <w:i/>
+          <w:color w:val="000000"/>
           <w:sz w:val="22"/>
         </w:rPr>
         <w:t>Figure 3.1: Component of Job Analysis</w:t>
       </w:r>
       <w:r>
         <w:rPr>
-          <w:rFonts w:ascii="Arial" w:hAnsi="Arial"/>
+          <w:rFonts w:ascii="Arial" w:hAnsi="Arial" w:cs="Arial"/>
           <w:b w:val="0"/>
           <w:i w:val="0"/>
+          <w:color w:val="000000"/>
           <w:sz w:val="22"/>
         </w:rPr>
         <w:t xml:space="preserve"> dalam KP rasmi).</w:t>
@@ -1276,112 +2054,125 @@
     </w:p>
     <w:p>
       <w:pPr>
-        <w:spacing w:after="160"/>
+        <w:spacing w:after="120" w:line="276" w:lineRule="auto"/>
+        <w:jc w:val="left"/>
       </w:pPr>
       <w:r>
         <w:rPr>
-          <w:rFonts w:ascii="Arial" w:hAnsi="Arial"/>
+          <w:rFonts w:ascii="Arial" w:hAnsi="Arial" w:cs="Arial"/>
           <w:b w:val="0"/>
           <w:i/>
+          <w:color w:val="000000"/>
           <w:sz w:val="22"/>
         </w:rPr>
         <w:t>Contoh studio:</w:t>
       </w:r>
       <w:r>
         <w:rPr>
-          <w:rFonts w:ascii="Arial" w:hAnsi="Arial"/>
+          <w:rFonts w:ascii="Arial" w:hAnsi="Arial" w:cs="Arial"/>
           <w:b w:val="0"/>
           <w:i w:val="0"/>
+          <w:color w:val="000000"/>
           <w:sz w:val="22"/>
         </w:rPr>
         <w:t xml:space="preserve"> huraian kerja bagi jawatan </w:t>
       </w:r>
       <w:r>
         <w:rPr>
-          <w:rFonts w:ascii="Arial" w:hAnsi="Arial"/>
+          <w:rFonts w:ascii="Arial" w:hAnsi="Arial" w:cs="Arial"/>
           <w:b w:val="0"/>
           <w:i/>
+          <w:color w:val="000000"/>
           <w:sz w:val="22"/>
         </w:rPr>
         <w:t>Assistant Video Editor</w:t>
       </w:r>
       <w:r>
         <w:rPr>
-          <w:rFonts w:ascii="Arial" w:hAnsi="Arial"/>
+          <w:rFonts w:ascii="Arial" w:hAnsi="Arial" w:cs="Arial"/>
           <w:b w:val="0"/>
           <w:i w:val="0"/>
+          <w:color w:val="000000"/>
           <w:sz w:val="22"/>
         </w:rPr>
         <w:t xml:space="preserve"> di 3U menetapkan tugas seperti </w:t>
       </w:r>
       <w:r>
         <w:rPr>
-          <w:rFonts w:ascii="Arial" w:hAnsi="Arial"/>
+          <w:rFonts w:ascii="Arial" w:hAnsi="Arial" w:cs="Arial"/>
           <w:b w:val="0"/>
           <w:i/>
+          <w:color w:val="000000"/>
           <w:sz w:val="22"/>
         </w:rPr>
         <w:t>logging footage</w:t>
       </w:r>
       <w:r>
         <w:rPr>
-          <w:rFonts w:ascii="Arial" w:hAnsi="Arial"/>
+          <w:rFonts w:ascii="Arial" w:hAnsi="Arial" w:cs="Arial"/>
           <w:b w:val="0"/>
           <w:i w:val="0"/>
+          <w:color w:val="000000"/>
           <w:sz w:val="22"/>
         </w:rPr>
         <w:t xml:space="preserve">, menyusun </w:t>
       </w:r>
       <w:r>
         <w:rPr>
-          <w:rFonts w:ascii="Arial" w:hAnsi="Arial"/>
+          <w:rFonts w:ascii="Arial" w:hAnsi="Arial" w:cs="Arial"/>
           <w:b w:val="0"/>
           <w:i/>
+          <w:color w:val="000000"/>
           <w:sz w:val="22"/>
         </w:rPr>
         <w:t>rough cut</w:t>
       </w:r>
       <w:r>
         <w:rPr>
-          <w:rFonts w:ascii="Arial" w:hAnsi="Arial"/>
+          <w:rFonts w:ascii="Arial" w:hAnsi="Arial" w:cs="Arial"/>
           <w:b w:val="0"/>
           <w:i w:val="0"/>
+          <w:color w:val="000000"/>
           <w:sz w:val="22"/>
         </w:rPr>
         <w:t xml:space="preserve">, dan menyimpan salinan </w:t>
       </w:r>
       <w:r>
         <w:rPr>
-          <w:rFonts w:ascii="Arial" w:hAnsi="Arial"/>
+          <w:rFonts w:ascii="Arial" w:hAnsi="Arial" w:cs="Arial"/>
           <w:b w:val="0"/>
           <w:i/>
+          <w:color w:val="000000"/>
           <w:sz w:val="22"/>
         </w:rPr>
         <w:t>backup</w:t>
       </w:r>
       <w:r>
         <w:rPr>
-          <w:rFonts w:ascii="Arial" w:hAnsi="Arial"/>
+          <w:rFonts w:ascii="Arial" w:hAnsi="Arial" w:cs="Arial"/>
           <w:b w:val="0"/>
           <w:i w:val="0"/>
+          <w:color w:val="000000"/>
           <w:sz w:val="22"/>
         </w:rPr>
         <w:t xml:space="preserve"> — supaya pekerja baharu jelas tentang skop tugasnya berbanding </w:t>
       </w:r>
       <w:r>
         <w:rPr>
-          <w:rFonts w:ascii="Arial" w:hAnsi="Arial"/>
+          <w:rFonts w:ascii="Arial" w:hAnsi="Arial" w:cs="Arial"/>
           <w:b w:val="0"/>
           <w:i/>
+          <w:color w:val="000000"/>
           <w:sz w:val="22"/>
         </w:rPr>
         <w:t>Senior Editor</w:t>
       </w:r>
       <w:r>
         <w:rPr>
-          <w:rFonts w:ascii="Arial" w:hAnsi="Arial"/>
+          <w:rFonts w:ascii="Arial" w:hAnsi="Arial" w:cs="Arial"/>
           <w:b w:val="0"/>
           <w:i w:val="0"/>
+          <w:color w:val="000000"/>
           <w:sz w:val="22"/>
         </w:rPr>
         <w:t>.</w:t>
@@ -1389,22 +2180,25 @@
     </w:p>
     <w:p>
       <w:pPr>
-        <w:spacing w:after="160"/>
+        <w:spacing w:after="120" w:line="276" w:lineRule="auto"/>
+        <w:jc w:val="left"/>
       </w:pPr>
       <w:r>
         <w:rPr>
-          <w:rFonts w:ascii="Arial" w:hAnsi="Arial"/>
+          <w:rFonts w:ascii="Arial" w:hAnsi="Arial" w:cs="Arial"/>
           <w:b/>
           <w:i w:val="0"/>
+          <w:color w:val="000000"/>
           <w:sz w:val="22"/>
         </w:rPr>
         <w:t>ii) Job procedure</w:t>
       </w:r>
       <w:r>
         <w:rPr>
-          <w:rFonts w:ascii="Arial" w:hAnsi="Arial"/>
+          <w:rFonts w:ascii="Arial" w:hAnsi="Arial" w:cs="Arial"/>
           <w:b w:val="0"/>
           <w:i w:val="0"/>
+          <w:color w:val="000000"/>
           <w:sz w:val="22"/>
         </w:rPr>
         <w:t xml:space="preserve"> — Prosedur kerja ditakrifkan sebagai prosedur bertulis yang mengenal pasti kerja yang perlu dilaksanakan mengikut urutan langkah demi langkah dengan penerangan terperinci bagaimana kerja itu dilaksanakan dari mula hingga selesai. Ia memainkan peranan penting dalam melaksanakan kerja dengan selamat, menyediakan latihan yang piawai dan membantu siasatan. Ia adalah dokumen prosedur contoh yang menunjukkan proses, alat dan rangka kerja untuk menganalisis tugas dan tanggungjawab kerja. Prosedur kerja yang direka dengan baik dapat membantu memahami kerja dengan betul. Prosedur kerja perlu melalui proses analisis kerja, dan perlu memahami dengan jelas keperluan kerja dan spesifikasi kerja.</w:t>
@@ -1412,112 +2206,125 @@
     </w:p>
     <w:p>
       <w:pPr>
-        <w:spacing w:after="160"/>
+        <w:spacing w:after="120" w:line="276" w:lineRule="auto"/>
+        <w:jc w:val="left"/>
       </w:pPr>
       <w:r>
         <w:rPr>
-          <w:rFonts w:ascii="Arial" w:hAnsi="Arial"/>
+          <w:rFonts w:ascii="Arial" w:hAnsi="Arial" w:cs="Arial"/>
           <w:b w:val="0"/>
           <w:i/>
+          <w:color w:val="000000"/>
           <w:sz w:val="22"/>
         </w:rPr>
         <w:t>Contoh studio:</w:t>
       </w:r>
       <w:r>
         <w:rPr>
-          <w:rFonts w:ascii="Arial" w:hAnsi="Arial"/>
+          <w:rFonts w:ascii="Arial" w:hAnsi="Arial" w:cs="Arial"/>
           <w:b w:val="0"/>
           <w:i w:val="0"/>
+          <w:color w:val="000000"/>
           <w:sz w:val="22"/>
         </w:rPr>
         <w:t xml:space="preserve"> prosedur kerja untuk </w:t>
       </w:r>
       <w:r>
         <w:rPr>
-          <w:rFonts w:ascii="Arial" w:hAnsi="Arial"/>
+          <w:rFonts w:ascii="Arial" w:hAnsi="Arial" w:cs="Arial"/>
           <w:b w:val="0"/>
           <w:i/>
+          <w:color w:val="000000"/>
           <w:sz w:val="22"/>
         </w:rPr>
         <w:t>export final cut</w:t>
       </w:r>
       <w:r>
         <w:rPr>
-          <w:rFonts w:ascii="Arial" w:hAnsi="Arial"/>
+          <w:rFonts w:ascii="Arial" w:hAnsi="Arial" w:cs="Arial"/>
           <w:b w:val="0"/>
           <w:i w:val="0"/>
+          <w:color w:val="000000"/>
           <w:sz w:val="22"/>
         </w:rPr>
         <w:t xml:space="preserve"> — daripada semakan </w:t>
       </w:r>
       <w:r>
         <w:rPr>
-          <w:rFonts w:ascii="Arial" w:hAnsi="Arial"/>
+          <w:rFonts w:ascii="Arial" w:hAnsi="Arial" w:cs="Arial"/>
           <w:b w:val="0"/>
           <w:i/>
+          <w:color w:val="000000"/>
           <w:sz w:val="22"/>
         </w:rPr>
         <w:t>timeline</w:t>
       </w:r>
       <w:r>
         <w:rPr>
-          <w:rFonts w:ascii="Arial" w:hAnsi="Arial"/>
+          <w:rFonts w:ascii="Arial" w:hAnsi="Arial" w:cs="Arial"/>
           <w:b w:val="0"/>
           <w:i w:val="0"/>
+          <w:color w:val="000000"/>
           <w:sz w:val="22"/>
         </w:rPr>
         <w:t xml:space="preserve">, semakan audio </w:t>
       </w:r>
       <w:r>
         <w:rPr>
-          <w:rFonts w:ascii="Arial" w:hAnsi="Arial"/>
+          <w:rFonts w:ascii="Arial" w:hAnsi="Arial" w:cs="Arial"/>
           <w:b w:val="0"/>
           <w:i/>
+          <w:color w:val="000000"/>
           <w:sz w:val="22"/>
         </w:rPr>
         <w:t>mixdown</w:t>
       </w:r>
       <w:r>
         <w:rPr>
-          <w:rFonts w:ascii="Arial" w:hAnsi="Arial"/>
+          <w:rFonts w:ascii="Arial" w:hAnsi="Arial" w:cs="Arial"/>
           <w:b w:val="0"/>
           <w:i w:val="0"/>
+          <w:color w:val="000000"/>
           <w:sz w:val="22"/>
         </w:rPr>
         <w:t xml:space="preserve">, format </w:t>
       </w:r>
       <w:r>
         <w:rPr>
-          <w:rFonts w:ascii="Arial" w:hAnsi="Arial"/>
+          <w:rFonts w:ascii="Arial" w:hAnsi="Arial" w:cs="Arial"/>
           <w:b w:val="0"/>
           <w:i/>
+          <w:color w:val="000000"/>
           <w:sz w:val="22"/>
         </w:rPr>
         <w:t>render</w:t>
       </w:r>
       <w:r>
         <w:rPr>
-          <w:rFonts w:ascii="Arial" w:hAnsi="Arial"/>
+          <w:rFonts w:ascii="Arial" w:hAnsi="Arial" w:cs="Arial"/>
           <w:b w:val="0"/>
           <w:i w:val="0"/>
+          <w:color w:val="000000"/>
           <w:sz w:val="22"/>
         </w:rPr>
         <w:t xml:space="preserve">, hingga penghantaran fail kepada klien — ditulis langkah demi langkah supaya sebarang </w:t>
       </w:r>
       <w:r>
         <w:rPr>
-          <w:rFonts w:ascii="Arial" w:hAnsi="Arial"/>
+          <w:rFonts w:ascii="Arial" w:hAnsi="Arial" w:cs="Arial"/>
           <w:b w:val="0"/>
           <w:i/>
+          <w:color w:val="000000"/>
           <w:sz w:val="22"/>
         </w:rPr>
         <w:t>Editor</w:t>
       </w:r>
       <w:r>
         <w:rPr>
-          <w:rFonts w:ascii="Arial" w:hAnsi="Arial"/>
+          <w:rFonts w:ascii="Arial" w:hAnsi="Arial" w:cs="Arial"/>
           <w:b w:val="0"/>
           <w:i w:val="0"/>
+          <w:color w:val="000000"/>
           <w:sz w:val="22"/>
         </w:rPr>
         <w:t xml:space="preserve"> boleh mengikutinya tanpa tersalah format penghantaran.</w:t>
@@ -1525,22 +2332,25 @@
     </w:p>
     <w:p>
       <w:pPr>
-        <w:spacing w:after="160"/>
+        <w:spacing w:after="120" w:line="276" w:lineRule="auto"/>
+        <w:jc w:val="left"/>
       </w:pPr>
       <w:r>
         <w:rPr>
-          <w:rFonts w:ascii="Arial" w:hAnsi="Arial"/>
+          <w:rFonts w:ascii="Arial" w:hAnsi="Arial" w:cs="Arial"/>
           <w:b/>
           <w:i w:val="0"/>
+          <w:color w:val="000000"/>
           <w:sz w:val="22"/>
         </w:rPr>
         <w:t>iii) Working procedure</w:t>
       </w:r>
       <w:r>
         <w:rPr>
-          <w:rFonts w:ascii="Arial" w:hAnsi="Arial"/>
+          <w:rFonts w:ascii="Arial" w:hAnsi="Arial" w:cs="Arial"/>
           <w:b w:val="0"/>
           <w:i w:val="0"/>
+          <w:color w:val="000000"/>
           <w:sz w:val="22"/>
         </w:rPr>
         <w:t xml:space="preserve"> — Tatacara kerja adalah cara ditetapkan untuk melaksanakan sesuatu tugas tertentu; ia adalah urutan langkah untuk melakukan kerja. Bukan bermaksud mahu menjadikan setiap pekerja seperti robot, tetapi supaya semua orang mengikuti amalan terbaik yang diiktiraf.</w:t>
@@ -1548,13 +2358,15 @@
     </w:p>
     <w:p>
       <w:pPr>
-        <w:spacing w:after="160"/>
+        <w:spacing w:after="120" w:line="276" w:lineRule="auto"/>
+        <w:jc w:val="left"/>
       </w:pPr>
       <w:r>
         <w:rPr>
-          <w:rFonts w:ascii="Arial" w:hAnsi="Arial"/>
+          <w:rFonts w:ascii="Arial" w:hAnsi="Arial" w:cs="Arial"/>
           <w:b w:val="0"/>
           <w:i w:val="0"/>
+          <w:color w:val="000000"/>
           <w:sz w:val="22"/>
         </w:rPr>
         <w:t>Kepentingan Tatacara Kerja Piawai:</w:t>
@@ -1563,12 +2375,16 @@
     <w:p>
       <w:pPr>
         <w:pStyle w:val="ListBullet"/>
+        <w:spacing w:line="276" w:lineRule="auto" w:after="40"/>
+        <w:ind w:left="357" w:hanging="357"/>
+        <w:jc w:val="left"/>
       </w:pPr>
       <w:r>
         <w:rPr>
-          <w:rFonts w:ascii="Arial" w:hAnsi="Arial"/>
+          <w:rFonts w:ascii="Arial" w:hAnsi="Arial" w:cs="Arial"/>
           <w:b w:val="0"/>
           <w:i w:val="0"/>
+          <w:color w:val="000000"/>
           <w:sz w:val="22"/>
         </w:rPr>
         <w:t>Cara terbaik memastikan konsistensi prestasi — bertindak sebagai peta jalan.</w:t>
@@ -1577,12 +2393,16 @@
     <w:p>
       <w:pPr>
         <w:pStyle w:val="ListBullet"/>
+        <w:spacing w:line="276" w:lineRule="auto" w:after="40"/>
+        <w:ind w:left="357" w:hanging="357"/>
+        <w:jc w:val="left"/>
       </w:pPr>
       <w:r>
         <w:rPr>
-          <w:rFonts w:ascii="Arial" w:hAnsi="Arial"/>
+          <w:rFonts w:ascii="Arial" w:hAnsi="Arial" w:cs="Arial"/>
           <w:b w:val="0"/>
           <w:i w:val="0"/>
+          <w:color w:val="000000"/>
           <w:sz w:val="22"/>
         </w:rPr>
         <w:t>Membolehkan penambahbaikan berterusan — menyampaikan jangkaan semua bekerja dengan cara yang sama.</w:t>
@@ -1591,12 +2411,16 @@
     <w:p>
       <w:pPr>
         <w:pStyle w:val="ListBullet"/>
+        <w:spacing w:line="276" w:lineRule="auto" w:after="40"/>
+        <w:ind w:left="357" w:hanging="357"/>
+        <w:jc w:val="left"/>
       </w:pPr>
       <w:r>
         <w:rPr>
-          <w:rFonts w:ascii="Arial" w:hAnsi="Arial"/>
+          <w:rFonts w:ascii="Arial" w:hAnsi="Arial" w:cs="Arial"/>
           <w:b w:val="0"/>
           <w:i w:val="0"/>
+          <w:color w:val="000000"/>
           <w:sz w:val="22"/>
         </w:rPr>
         <w:t>Bukan kekal selama-lamanya — jika seseorang menemui cara lebih baik, ia boleh menjadi piawai baharu.</w:t>
@@ -1605,12 +2429,16 @@
     <w:p>
       <w:pPr>
         <w:pStyle w:val="ListBullet"/>
+        <w:spacing w:line="276" w:lineRule="auto" w:after="40"/>
+        <w:ind w:left="357" w:hanging="357"/>
+        <w:jc w:val="left"/>
       </w:pPr>
       <w:r>
         <w:rPr>
-          <w:rFonts w:ascii="Arial" w:hAnsi="Arial"/>
+          <w:rFonts w:ascii="Arial" w:hAnsi="Arial" w:cs="Arial"/>
           <w:b w:val="0"/>
           <w:i w:val="0"/>
+          <w:color w:val="000000"/>
           <w:sz w:val="22"/>
         </w:rPr>
         <w:t>Membolehkan pengukuran prestasi secara adil.</w:t>
@@ -1619,12 +2447,16 @@
     <w:p>
       <w:pPr>
         <w:pStyle w:val="ListBullet"/>
+        <w:spacing w:line="276" w:lineRule="auto" w:after="40"/>
+        <w:ind w:left="357" w:hanging="357"/>
+        <w:jc w:val="left"/>
       </w:pPr>
       <w:r>
         <w:rPr>
-          <w:rFonts w:ascii="Arial" w:hAnsi="Arial"/>
+          <w:rFonts w:ascii="Arial" w:hAnsi="Arial" w:cs="Arial"/>
           <w:b w:val="0"/>
           <w:i w:val="0"/>
+          <w:color w:val="000000"/>
           <w:sz w:val="22"/>
         </w:rPr>
         <w:t>Meningkatkan kemungkinan semua aktiviti dijalankan dengan selamat.</w:t>
@@ -1633,12 +2465,16 @@
     <w:p>
       <w:pPr>
         <w:pStyle w:val="ListBullet"/>
+        <w:spacing w:line="276" w:lineRule="auto" w:after="40"/>
+        <w:ind w:left="357" w:hanging="357"/>
+        <w:jc w:val="left"/>
       </w:pPr>
       <w:r>
         <w:rPr>
-          <w:rFonts w:ascii="Arial" w:hAnsi="Arial"/>
+          <w:rFonts w:ascii="Arial" w:hAnsi="Arial" w:cs="Arial"/>
           <w:b w:val="0"/>
           <w:i w:val="0"/>
+          <w:color w:val="000000"/>
           <w:sz w:val="22"/>
         </w:rPr>
         <w:t>Penting semasa melatih pekerja baharu supaya tidak diajar teknik berbeza oleh pekerja berbeza.</w:t>
@@ -1646,112 +2482,125 @@
     </w:p>
     <w:p>
       <w:pPr>
-        <w:spacing w:after="160"/>
+        <w:spacing w:after="120" w:line="276" w:lineRule="auto"/>
+        <w:jc w:val="left"/>
       </w:pPr>
       <w:r>
         <w:rPr>
-          <w:rFonts w:ascii="Arial" w:hAnsi="Arial"/>
+          <w:rFonts w:ascii="Arial" w:hAnsi="Arial" w:cs="Arial"/>
           <w:b w:val="0"/>
           <w:i/>
+          <w:color w:val="000000"/>
           <w:sz w:val="22"/>
         </w:rPr>
         <w:t>Contoh studio:</w:t>
       </w:r>
       <w:r>
         <w:rPr>
-          <w:rFonts w:ascii="Arial" w:hAnsi="Arial"/>
+          <w:rFonts w:ascii="Arial" w:hAnsi="Arial" w:cs="Arial"/>
           <w:b w:val="0"/>
           <w:i w:val="0"/>
+          <w:color w:val="000000"/>
           <w:sz w:val="22"/>
         </w:rPr>
         <w:t xml:space="preserve"> tatacara kerja </w:t>
       </w:r>
       <w:r>
         <w:rPr>
-          <w:rFonts w:ascii="Arial" w:hAnsi="Arial"/>
+          <w:rFonts w:ascii="Arial" w:hAnsi="Arial" w:cs="Arial"/>
           <w:b w:val="0"/>
           <w:i/>
+          <w:color w:val="000000"/>
           <w:sz w:val="22"/>
         </w:rPr>
         <w:t>ingest</w:t>
       </w:r>
       <w:r>
         <w:rPr>
-          <w:rFonts w:ascii="Arial" w:hAnsi="Arial"/>
+          <w:rFonts w:ascii="Arial" w:hAnsi="Arial" w:cs="Arial"/>
           <w:b w:val="0"/>
           <w:i w:val="0"/>
+          <w:color w:val="000000"/>
           <w:sz w:val="22"/>
         </w:rPr>
         <w:t xml:space="preserve"> dan </w:t>
       </w:r>
       <w:r>
         <w:rPr>
-          <w:rFonts w:ascii="Arial" w:hAnsi="Arial"/>
+          <w:rFonts w:ascii="Arial" w:hAnsi="Arial" w:cs="Arial"/>
           <w:b w:val="0"/>
           <w:i/>
+          <w:color w:val="000000"/>
           <w:sz w:val="22"/>
         </w:rPr>
         <w:t>backup</w:t>
       </w:r>
       <w:r>
         <w:rPr>
-          <w:rFonts w:ascii="Arial" w:hAnsi="Arial"/>
+          <w:rFonts w:ascii="Arial" w:hAnsi="Arial" w:cs="Arial"/>
           <w:b w:val="0"/>
           <w:i w:val="0"/>
+          <w:color w:val="000000"/>
           <w:sz w:val="22"/>
         </w:rPr>
         <w:t xml:space="preserve"> footage baru dari kamera ke </w:t>
       </w:r>
       <w:r>
         <w:rPr>
-          <w:rFonts w:ascii="Arial" w:hAnsi="Arial"/>
+          <w:rFonts w:ascii="Arial" w:hAnsi="Arial" w:cs="Arial"/>
           <w:b w:val="0"/>
           <w:i/>
+          <w:color w:val="000000"/>
           <w:sz w:val="22"/>
         </w:rPr>
         <w:t>server</w:t>
       </w:r>
       <w:r>
         <w:rPr>
-          <w:rFonts w:ascii="Arial" w:hAnsi="Arial"/>
+          <w:rFonts w:ascii="Arial" w:hAnsi="Arial" w:cs="Arial"/>
           <w:b w:val="0"/>
           <w:i w:val="0"/>
+          <w:color w:val="000000"/>
           <w:sz w:val="22"/>
         </w:rPr>
         <w:t xml:space="preserve"> studio ditetapkan piawai supaya setiap </w:t>
       </w:r>
       <w:r>
         <w:rPr>
-          <w:rFonts w:ascii="Arial" w:hAnsi="Arial"/>
+          <w:rFonts w:ascii="Arial" w:hAnsi="Arial" w:cs="Arial"/>
           <w:b w:val="0"/>
           <w:i/>
+          <w:color w:val="000000"/>
           <w:sz w:val="22"/>
         </w:rPr>
         <w:t>Editor</w:t>
       </w:r>
       <w:r>
         <w:rPr>
-          <w:rFonts w:ascii="Arial" w:hAnsi="Arial"/>
+          <w:rFonts w:ascii="Arial" w:hAnsi="Arial" w:cs="Arial"/>
           <w:b w:val="0"/>
           <w:i w:val="0"/>
+          <w:color w:val="000000"/>
           <w:sz w:val="22"/>
         </w:rPr>
         <w:t xml:space="preserve"> menyalin fail dengan urutan sama (salin → semak </w:t>
       </w:r>
       <w:r>
         <w:rPr>
-          <w:rFonts w:ascii="Arial" w:hAnsi="Arial"/>
+          <w:rFonts w:ascii="Arial" w:hAnsi="Arial" w:cs="Arial"/>
           <w:b w:val="0"/>
           <w:i/>
+          <w:color w:val="000000"/>
           <w:sz w:val="22"/>
         </w:rPr>
         <w:t>checksum</w:t>
       </w:r>
       <w:r>
         <w:rPr>
-          <w:rFonts w:ascii="Arial" w:hAnsi="Arial"/>
+          <w:rFonts w:ascii="Arial" w:hAnsi="Arial" w:cs="Arial"/>
           <w:b w:val="0"/>
           <w:i w:val="0"/>
+          <w:color w:val="000000"/>
           <w:sz w:val="22"/>
         </w:rPr>
         <w:t xml:space="preserve"> → padam kad memori), mengelakkan kehilangan data klien.</w:t>
@@ -1759,40 +2608,45 @@
     </w:p>
     <w:p>
       <w:pPr>
-        <w:spacing w:after="160"/>
+        <w:spacing w:after="120" w:line="276" w:lineRule="auto"/>
+        <w:jc w:val="left"/>
       </w:pPr>
       <w:r>
         <w:rPr>
-          <w:rFonts w:ascii="Arial" w:hAnsi="Arial"/>
+          <w:rFonts w:ascii="Arial" w:hAnsi="Arial" w:cs="Arial"/>
           <w:b/>
           <w:i w:val="0"/>
+          <w:color w:val="000000"/>
           <w:sz w:val="22"/>
         </w:rPr>
         <w:t>iv) Working Instruction</w:t>
       </w:r>
       <w:r>
         <w:rPr>
-          <w:rFonts w:ascii="Arial" w:hAnsi="Arial"/>
+          <w:rFonts w:ascii="Arial" w:hAnsi="Arial" w:cs="Arial"/>
           <w:b w:val="0"/>
           <w:i w:val="0"/>
+          <w:color w:val="000000"/>
           <w:sz w:val="22"/>
         </w:rPr>
         <w:t xml:space="preserve"> — Arahan kerja adalah garis panduan yang perlu diikuti dalam menyiapkan sesuatu tugas atau bagaimana melaksanakan sesuatu tugas. Arahan kerja dibangunkan untuk membimbing pekerja dalam empat bidang kualiti utama: latihan, rujukan, penyelesaian masalah dan penambahbaikan berterusan, berdasarkan kitaran </w:t>
       </w:r>
       <w:r>
         <w:rPr>
-          <w:rFonts w:ascii="Arial" w:hAnsi="Arial"/>
+          <w:rFonts w:ascii="Arial" w:hAnsi="Arial" w:cs="Arial"/>
           <w:b w:val="0"/>
           <w:i/>
+          <w:color w:val="000000"/>
           <w:sz w:val="22"/>
         </w:rPr>
         <w:t>Plan-Do-Check-Act</w:t>
       </w:r>
       <w:r>
         <w:rPr>
-          <w:rFonts w:ascii="Arial" w:hAnsi="Arial"/>
+          <w:rFonts w:ascii="Arial" w:hAnsi="Arial" w:cs="Arial"/>
           <w:b w:val="0"/>
           <w:i w:val="0"/>
+          <w:color w:val="000000"/>
           <w:sz w:val="22"/>
         </w:rPr>
         <w:t>:</w:t>
@@ -1801,21 +2655,26 @@
     <w:p>
       <w:pPr>
         <w:pStyle w:val="ListBullet"/>
+        <w:spacing w:line="276" w:lineRule="auto" w:after="40"/>
+        <w:ind w:left="357" w:hanging="357"/>
+        <w:jc w:val="left"/>
       </w:pPr>
       <w:r>
         <w:rPr>
-          <w:rFonts w:ascii="Arial" w:hAnsi="Arial"/>
+          <w:rFonts w:ascii="Arial" w:hAnsi="Arial" w:cs="Arial"/>
           <w:b/>
           <w:i w:val="0"/>
+          <w:color w:val="000000"/>
           <w:sz w:val="22"/>
         </w:rPr>
         <w:t>Latihan (Plan)</w:t>
       </w:r>
       <w:r>
         <w:rPr>
-          <w:rFonts w:ascii="Arial" w:hAnsi="Arial"/>
+          <w:rFonts w:ascii="Arial" w:hAnsi="Arial" w:cs="Arial"/>
           <w:b w:val="0"/>
           <w:i w:val="0"/>
+          <w:color w:val="000000"/>
           <w:sz w:val="22"/>
         </w:rPr>
         <w:t xml:space="preserve"> — langkah pertama penting memastikan pekerja cekap dalam tugas mereka; pekerja baharu memulakan latihan bersama pakar proses untuk memerhati bagaimana proses dilaksanakan.</w:t>
@@ -1824,21 +2683,26 @@
     <w:p>
       <w:pPr>
         <w:pStyle w:val="ListBullet"/>
+        <w:spacing w:line="276" w:lineRule="auto" w:after="40"/>
+        <w:ind w:left="357" w:hanging="357"/>
+        <w:jc w:val="left"/>
       </w:pPr>
       <w:r>
         <w:rPr>
-          <w:rFonts w:ascii="Arial" w:hAnsi="Arial"/>
+          <w:rFonts w:ascii="Arial" w:hAnsi="Arial" w:cs="Arial"/>
           <w:b/>
           <w:i w:val="0"/>
+          <w:color w:val="000000"/>
           <w:sz w:val="22"/>
         </w:rPr>
         <w:t>Rujukan (Do)</w:t>
       </w:r>
       <w:r>
         <w:rPr>
-          <w:rFonts w:ascii="Arial" w:hAnsi="Arial"/>
+          <w:rFonts w:ascii="Arial" w:hAnsi="Arial" w:cs="Arial"/>
           <w:b w:val="0"/>
           <w:i w:val="0"/>
+          <w:color w:val="000000"/>
           <w:sz w:val="22"/>
         </w:rPr>
         <w:t xml:space="preserve"> — memberi tumpuan kepada akses dan format arahan supaya pekerja mudah mendapatkan maklumat berkaitan bidang tanggungjawab mereka.</w:t>
@@ -1847,21 +2711,26 @@
     <w:p>
       <w:pPr>
         <w:pStyle w:val="ListBullet"/>
+        <w:spacing w:line="276" w:lineRule="auto" w:after="40"/>
+        <w:ind w:left="357" w:hanging="357"/>
+        <w:jc w:val="left"/>
       </w:pPr>
       <w:r>
         <w:rPr>
-          <w:rFonts w:ascii="Arial" w:hAnsi="Arial"/>
+          <w:rFonts w:ascii="Arial" w:hAnsi="Arial" w:cs="Arial"/>
           <w:b/>
           <w:i w:val="0"/>
+          <w:color w:val="000000"/>
           <w:sz w:val="22"/>
         </w:rPr>
         <w:t>Penyelesaian Masalah (Check)</w:t>
       </w:r>
       <w:r>
         <w:rPr>
-          <w:rFonts w:ascii="Arial" w:hAnsi="Arial"/>
+          <w:rFonts w:ascii="Arial" w:hAnsi="Arial" w:cs="Arial"/>
           <w:b w:val="0"/>
           <w:i w:val="0"/>
+          <w:color w:val="000000"/>
           <w:sz w:val="22"/>
         </w:rPr>
         <w:t xml:space="preserve"> — arahan kerja menjadi dokumen rujukan utama apabila berlaku ketidakpatuhan dalaman atau luaran; semakan arahan menjadi sebahagian proses tindakan pembetulan.</w:t>
@@ -1870,21 +2739,26 @@
     <w:p>
       <w:pPr>
         <w:pStyle w:val="ListBullet"/>
+        <w:spacing w:line="276" w:lineRule="auto" w:after="40"/>
+        <w:ind w:left="357" w:hanging="357"/>
+        <w:jc w:val="left"/>
       </w:pPr>
       <w:r>
         <w:rPr>
-          <w:rFonts w:ascii="Arial" w:hAnsi="Arial"/>
+          <w:rFonts w:ascii="Arial" w:hAnsi="Arial" w:cs="Arial"/>
           <w:b/>
           <w:i w:val="0"/>
+          <w:color w:val="000000"/>
           <w:sz w:val="22"/>
         </w:rPr>
         <w:t>Penambahbaikan Berterusan (Act)</w:t>
       </w:r>
       <w:r>
         <w:rPr>
-          <w:rFonts w:ascii="Arial" w:hAnsi="Arial"/>
+          <w:rFonts w:ascii="Arial" w:hAnsi="Arial" w:cs="Arial"/>
           <w:b w:val="0"/>
           <w:i w:val="0"/>
+          <w:color w:val="000000"/>
           <w:sz w:val="22"/>
         </w:rPr>
         <w:t xml:space="preserve"> — arahan kerja bukan dokumen statik; ia disemak semula apabila peluang penambahbaikan dikenal pasti melalui semakan dokumen, audit dan input daripada pakar yang melaksanakan tugas.</w:t>
@@ -1892,166 +2766,189 @@
     </w:p>
     <w:p>
       <w:pPr>
-        <w:spacing w:after="160"/>
+        <w:spacing w:after="120" w:line="276" w:lineRule="auto"/>
+        <w:jc w:val="left"/>
       </w:pPr>
       <w:r>
         <w:rPr>
-          <w:rFonts w:ascii="Arial" w:hAnsi="Arial"/>
+          <w:rFonts w:ascii="Arial" w:hAnsi="Arial" w:cs="Arial"/>
           <w:b w:val="0"/>
           <w:i/>
+          <w:color w:val="000000"/>
           <w:sz w:val="22"/>
         </w:rPr>
         <w:t>Contoh studio:</w:t>
       </w:r>
       <w:r>
         <w:rPr>
-          <w:rFonts w:ascii="Arial" w:hAnsi="Arial"/>
+          <w:rFonts w:ascii="Arial" w:hAnsi="Arial" w:cs="Arial"/>
           <w:b w:val="0"/>
           <w:i w:val="0"/>
+          <w:color w:val="000000"/>
           <w:sz w:val="22"/>
         </w:rPr>
         <w:t xml:space="preserve"> arahan kerja </w:t>
       </w:r>
       <w:r>
         <w:rPr>
-          <w:rFonts w:ascii="Arial" w:hAnsi="Arial"/>
+          <w:rFonts w:ascii="Arial" w:hAnsi="Arial" w:cs="Arial"/>
           <w:b w:val="0"/>
           <w:i/>
+          <w:color w:val="000000"/>
           <w:sz w:val="22"/>
         </w:rPr>
         <w:t>(work instruction)</w:t>
       </w:r>
       <w:r>
         <w:rPr>
-          <w:rFonts w:ascii="Arial" w:hAnsi="Arial"/>
+          <w:rFonts w:ascii="Arial" w:hAnsi="Arial" w:cs="Arial"/>
           <w:b w:val="0"/>
           <w:i w:val="0"/>
+          <w:color w:val="000000"/>
           <w:sz w:val="22"/>
         </w:rPr>
         <w:t xml:space="preserve"> untuk memulakan sesi </w:t>
       </w:r>
       <w:r>
         <w:rPr>
-          <w:rFonts w:ascii="Arial" w:hAnsi="Arial"/>
+          <w:rFonts w:ascii="Arial" w:hAnsi="Arial" w:cs="Arial"/>
           <w:b w:val="0"/>
           <w:i/>
+          <w:color w:val="000000"/>
           <w:sz w:val="22"/>
         </w:rPr>
         <w:t>color grading</w:t>
       </w:r>
       <w:r>
         <w:rPr>
-          <w:rFonts w:ascii="Arial" w:hAnsi="Arial"/>
+          <w:rFonts w:ascii="Arial" w:hAnsi="Arial" w:cs="Arial"/>
           <w:b w:val="0"/>
           <w:i w:val="0"/>
+          <w:color w:val="000000"/>
           <w:sz w:val="22"/>
         </w:rPr>
         <w:t xml:space="preserve"> di suite penyuntingan — daripada kalibrasi monitor, memuat naik </w:t>
       </w:r>
       <w:r>
         <w:rPr>
-          <w:rFonts w:ascii="Arial" w:hAnsi="Arial"/>
+          <w:rFonts w:ascii="Arial" w:hAnsi="Arial" w:cs="Arial"/>
           <w:b w:val="0"/>
           <w:i/>
+          <w:color w:val="000000"/>
           <w:sz w:val="22"/>
         </w:rPr>
         <w:t>LUT</w:t>
       </w:r>
       <w:r>
         <w:rPr>
-          <w:rFonts w:ascii="Arial" w:hAnsi="Arial"/>
+          <w:rFonts w:ascii="Arial" w:hAnsi="Arial" w:cs="Arial"/>
           <w:b w:val="0"/>
           <w:i w:val="0"/>
+          <w:color w:val="000000"/>
           <w:sz w:val="22"/>
         </w:rPr>
         <w:t xml:space="preserve"> projek, hingga menyimpan versi </w:t>
       </w:r>
       <w:r>
         <w:rPr>
-          <w:rFonts w:ascii="Arial" w:hAnsi="Arial"/>
+          <w:rFonts w:ascii="Arial" w:hAnsi="Arial" w:cs="Arial"/>
           <w:b w:val="0"/>
           <w:i/>
+          <w:color w:val="000000"/>
           <w:sz w:val="22"/>
         </w:rPr>
         <w:t>grade</w:t>
       </w:r>
       <w:r>
         <w:rPr>
-          <w:rFonts w:ascii="Arial" w:hAnsi="Arial"/>
+          <w:rFonts w:ascii="Arial" w:hAnsi="Arial" w:cs="Arial"/>
           <w:b w:val="0"/>
           <w:i w:val="0"/>
+          <w:color w:val="000000"/>
           <w:sz w:val="22"/>
         </w:rPr>
         <w:t xml:space="preserve"> — dilatih kepada </w:t>
       </w:r>
       <w:r>
         <w:rPr>
-          <w:rFonts w:ascii="Arial" w:hAnsi="Arial"/>
+          <w:rFonts w:ascii="Arial" w:hAnsi="Arial" w:cs="Arial"/>
           <w:b w:val="0"/>
           <w:i/>
+          <w:color w:val="000000"/>
           <w:sz w:val="22"/>
         </w:rPr>
         <w:t>Editor</w:t>
       </w:r>
       <w:r>
         <w:rPr>
-          <w:rFonts w:ascii="Arial" w:hAnsi="Arial"/>
+          <w:rFonts w:ascii="Arial" w:hAnsi="Arial" w:cs="Arial"/>
           <w:b w:val="0"/>
           <w:i w:val="0"/>
+          <w:color w:val="000000"/>
           <w:sz w:val="22"/>
         </w:rPr>
         <w:t xml:space="preserve"> baharu oleh </w:t>
       </w:r>
       <w:r>
         <w:rPr>
-          <w:rFonts w:ascii="Arial" w:hAnsi="Arial"/>
+          <w:rFonts w:ascii="Arial" w:hAnsi="Arial" w:cs="Arial"/>
           <w:b w:val="0"/>
           <w:i/>
+          <w:color w:val="000000"/>
           <w:sz w:val="22"/>
         </w:rPr>
         <w:t>Senior Colourist</w:t>
       </w:r>
       <w:r>
         <w:rPr>
-          <w:rFonts w:ascii="Arial" w:hAnsi="Arial"/>
+          <w:rFonts w:ascii="Arial" w:hAnsi="Arial" w:cs="Arial"/>
           <w:b w:val="0"/>
           <w:i w:val="0"/>
+          <w:color w:val="000000"/>
           <w:sz w:val="22"/>
         </w:rPr>
         <w:t xml:space="preserve"> mengikut kitaran Plan-Do-Check-Act di atas.</w:t>
       </w:r>
     </w:p>
     <w:p>
+      <w:pPr>
+        <w:spacing w:before="120" w:after="120" w:line="276" w:lineRule="auto"/>
+        <w:jc w:val="left"/>
+      </w:pPr>
       <w:r>
         <w:rPr>
-          <w:rFonts w:ascii="Arial" w:hAnsi="Arial"/>
+          <w:rFonts w:ascii="Arial" w:hAnsi="Arial" w:cs="Arial"/>
           <w:b/>
-          <w:sz w:val="24"/>
+          <w:color w:val="000000"/>
+          <w:sz w:val="22"/>
         </w:rPr>
         <w:t>SOALAN</w:t>
       </w:r>
       <w:r>
         <w:rPr>
-          <w:rFonts w:ascii="Arial" w:hAnsi="Arial"/>
+          <w:rFonts w:ascii="Arial" w:hAnsi="Arial" w:cs="Arial"/>
           <w:b/>
-          <w:sz w:val="24"/>
+          <w:color w:val="000000"/>
+          <w:sz w:val="22"/>
         </w:rPr>
         <w:t>/</w:t>
       </w:r>
       <w:r>
         <w:rPr>
-          <w:rFonts w:ascii="Arial" w:hAnsi="Arial"/>
+          <w:rFonts w:ascii="Arial" w:hAnsi="Arial" w:cs="Arial"/>
           <w:b/>
           <w:i/>
-          <w:sz w:val="24"/>
+          <w:color w:val="000000"/>
+          <w:sz w:val="22"/>
         </w:rPr>
         <w:t>QUESTION</w:t>
       </w:r>
       <w:r>
         <w:rPr>
-          <w:rFonts w:ascii="Arial" w:hAnsi="Arial"/>
+          <w:rFonts w:ascii="Arial" w:hAnsi="Arial" w:cs="Arial"/>
           <w:b/>
-          <w:sz w:val="24"/>
+          <w:color w:val="000000"/>
+          <w:sz w:val="22"/>
         </w:rPr>
         <w:t>:</w:t>
       </w:r>
@@ -2059,13 +2956,15 @@
     <w:p/>
     <w:p>
       <w:pPr>
-        <w:spacing w:after="160"/>
+        <w:spacing w:after="120" w:before="120" w:line="276" w:lineRule="auto"/>
+        <w:jc w:val="left"/>
       </w:pPr>
       <w:r>
         <w:rPr>
-          <w:rFonts w:ascii="Arial" w:hAnsi="Arial"/>
+          <w:rFonts w:ascii="Arial" w:hAnsi="Arial" w:cs="Arial"/>
           <w:b/>
           <w:i w:val="0"/>
+          <w:color w:val="000000"/>
           <w:sz w:val="22"/>
         </w:rPr>
         <w:t>1. Apakah kepentingan bahasa kerja di tempat kerja dalam organisasi?</w:t>
@@ -2073,94 +2972,105 @@
     </w:p>
     <w:p>
       <w:pPr>
-        <w:spacing w:after="160"/>
+        <w:spacing w:after="120" w:line="276" w:lineRule="auto"/>
+        <w:jc w:val="left"/>
       </w:pPr>
       <w:r>
         <w:rPr>
-          <w:rFonts w:ascii="Arial" w:hAnsi="Arial"/>
+          <w:rFonts w:ascii="Arial" w:hAnsi="Arial" w:cs="Arial"/>
           <w:b w:val="0"/>
           <w:i/>
+          <w:color w:val="000000"/>
           <w:sz w:val="22"/>
         </w:rPr>
         <w:t>Jawapan model:</w:t>
       </w:r>
       <w:r>
         <w:rPr>
-          <w:rFonts w:ascii="Arial" w:hAnsi="Arial"/>
+          <w:rFonts w:ascii="Arial" w:hAnsi="Arial" w:cs="Arial"/>
           <w:b w:val="0"/>
           <w:i w:val="0"/>
+          <w:color w:val="000000"/>
           <w:sz w:val="22"/>
         </w:rPr>
         <w:t xml:space="preserve"> Bahasa kerja memastikan semua pekerja daripada pelbagai latar belakang bahasa dapat berkomunikasi tanpa salah faham, terutamanya dalam hal keselamatan dan prestasi kerja. Di studio penyuntingan video 3U, bahasa kerja yang seragam (contohnya Bahasa Inggeris untuk komunikasi dengan klien antarabangsa, Bahasa Malaysia untuk arahan dalaman) memastikan arahan mengenai </w:t>
       </w:r>
       <w:r>
         <w:rPr>
-          <w:rFonts w:ascii="Arial" w:hAnsi="Arial"/>
+          <w:rFonts w:ascii="Arial" w:hAnsi="Arial" w:cs="Arial"/>
           <w:b w:val="0"/>
           <w:i/>
+          <w:color w:val="000000"/>
           <w:sz w:val="22"/>
         </w:rPr>
         <w:t>timeline</w:t>
       </w:r>
       <w:r>
         <w:rPr>
-          <w:rFonts w:ascii="Arial" w:hAnsi="Arial"/>
+          <w:rFonts w:ascii="Arial" w:hAnsi="Arial" w:cs="Arial"/>
           <w:b w:val="0"/>
           <w:i w:val="0"/>
+          <w:color w:val="000000"/>
           <w:sz w:val="22"/>
         </w:rPr>
         <w:t xml:space="preserve">, </w:t>
       </w:r>
       <w:r>
         <w:rPr>
-          <w:rFonts w:ascii="Arial" w:hAnsi="Arial"/>
+          <w:rFonts w:ascii="Arial" w:hAnsi="Arial" w:cs="Arial"/>
           <w:b w:val="0"/>
           <w:i/>
+          <w:color w:val="000000"/>
           <w:sz w:val="22"/>
         </w:rPr>
         <w:t>deadline</w:t>
       </w:r>
       <w:r>
         <w:rPr>
-          <w:rFonts w:ascii="Arial" w:hAnsi="Arial"/>
+          <w:rFonts w:ascii="Arial" w:hAnsi="Arial" w:cs="Arial"/>
           <w:b w:val="0"/>
           <w:i w:val="0"/>
+          <w:color w:val="000000"/>
           <w:sz w:val="22"/>
         </w:rPr>
         <w:t xml:space="preserve"> dan format penghantaran fail difahami sama oleh semua </w:t>
       </w:r>
       <w:r>
         <w:rPr>
-          <w:rFonts w:ascii="Arial" w:hAnsi="Arial"/>
+          <w:rFonts w:ascii="Arial" w:hAnsi="Arial" w:cs="Arial"/>
           <w:b w:val="0"/>
           <w:i/>
+          <w:color w:val="000000"/>
           <w:sz w:val="22"/>
         </w:rPr>
         <w:t>Editor</w:t>
       </w:r>
       <w:r>
         <w:rPr>
-          <w:rFonts w:ascii="Arial" w:hAnsi="Arial"/>
+          <w:rFonts w:ascii="Arial" w:hAnsi="Arial" w:cs="Arial"/>
           <w:b w:val="0"/>
           <w:i w:val="0"/>
+          <w:color w:val="000000"/>
           <w:sz w:val="22"/>
         </w:rPr>
         <w:t xml:space="preserve"> dan </w:t>
       </w:r>
       <w:r>
         <w:rPr>
-          <w:rFonts w:ascii="Arial" w:hAnsi="Arial"/>
+          <w:rFonts w:ascii="Arial" w:hAnsi="Arial" w:cs="Arial"/>
           <w:b w:val="0"/>
           <w:i/>
+          <w:color w:val="000000"/>
           <w:sz w:val="22"/>
         </w:rPr>
         <w:t>Producer</w:t>
       </w:r>
       <w:r>
         <w:rPr>
-          <w:rFonts w:ascii="Arial" w:hAnsi="Arial"/>
+          <w:rFonts w:ascii="Arial" w:hAnsi="Arial" w:cs="Arial"/>
           <w:b w:val="0"/>
           <w:i w:val="0"/>
+          <w:color w:val="000000"/>
           <w:sz w:val="22"/>
         </w:rPr>
         <w:t>.</w:t>
@@ -2168,13 +3078,15 @@
     </w:p>
     <w:p>
       <w:pPr>
-        <w:spacing w:after="160"/>
+        <w:spacing w:after="120" w:before="120" w:line="276" w:lineRule="auto"/>
+        <w:jc w:val="left"/>
       </w:pPr>
       <w:r>
         <w:rPr>
-          <w:rFonts w:ascii="Arial" w:hAnsi="Arial"/>
+          <w:rFonts w:ascii="Arial" w:hAnsi="Arial" w:cs="Arial"/>
           <w:b/>
           <w:i w:val="0"/>
+          <w:color w:val="000000"/>
           <w:sz w:val="22"/>
         </w:rPr>
         <w:t>2. Apakah bahan rujukan kerja di tempat kerja?</w:t>
@@ -2182,40 +3094,45 @@
     </w:p>
     <w:p>
       <w:pPr>
-        <w:spacing w:after="160"/>
+        <w:spacing w:after="120" w:line="276" w:lineRule="auto"/>
+        <w:jc w:val="left"/>
       </w:pPr>
       <w:r>
         <w:rPr>
-          <w:rFonts w:ascii="Arial" w:hAnsi="Arial"/>
+          <w:rFonts w:ascii="Arial" w:hAnsi="Arial" w:cs="Arial"/>
           <w:b w:val="0"/>
           <w:i/>
+          <w:color w:val="000000"/>
           <w:sz w:val="22"/>
         </w:rPr>
         <w:t>Jawapan model:</w:t>
       </w:r>
       <w:r>
         <w:rPr>
-          <w:rFonts w:ascii="Arial" w:hAnsi="Arial"/>
+          <w:rFonts w:ascii="Arial" w:hAnsi="Arial" w:cs="Arial"/>
           <w:b w:val="0"/>
           <w:i w:val="0"/>
+          <w:color w:val="000000"/>
           <w:sz w:val="22"/>
         </w:rPr>
         <w:t xml:space="preserve"> Bahan rujukan kerja adalah dokumen bertulis yang menerangkan skop tugas dan aktiviti khusus dalam organisasi, membantu pekerja fokus kepada kerja berdasarkan skop, persekitaran dan keadaan kerja — contohnya manual prosedur </w:t>
       </w:r>
       <w:r>
         <w:rPr>
-          <w:rFonts w:ascii="Arial" w:hAnsi="Arial"/>
+          <w:rFonts w:ascii="Arial" w:hAnsi="Arial" w:cs="Arial"/>
           <w:b w:val="0"/>
           <w:i/>
+          <w:color w:val="000000"/>
           <w:sz w:val="22"/>
         </w:rPr>
         <w:t>ingest footage</w:t>
       </w:r>
       <w:r>
         <w:rPr>
-          <w:rFonts w:ascii="Arial" w:hAnsi="Arial"/>
+          <w:rFonts w:ascii="Arial" w:hAnsi="Arial" w:cs="Arial"/>
           <w:b w:val="0"/>
           <w:i w:val="0"/>
+          <w:color w:val="000000"/>
           <w:sz w:val="22"/>
         </w:rPr>
         <w:t xml:space="preserve"> di studio penyuntingan video.</w:t>
@@ -2223,13 +3140,15 @@
     </w:p>
     <w:p>
       <w:pPr>
-        <w:spacing w:after="160"/>
+        <w:spacing w:after="120" w:before="120" w:line="276" w:lineRule="auto"/>
+        <w:jc w:val="left"/>
       </w:pPr>
       <w:r>
         <w:rPr>
-          <w:rFonts w:ascii="Arial" w:hAnsi="Arial"/>
+          <w:rFonts w:ascii="Arial" w:hAnsi="Arial" w:cs="Arial"/>
           <w:b/>
           <w:i w:val="0"/>
+          <w:color w:val="000000"/>
           <w:sz w:val="22"/>
         </w:rPr>
         <w:t>3. Namakan jenis-jenis bahan rujukan kerja yang biasa digunakan di tempat kerja.</w:t>
@@ -2237,94 +3156,105 @@
     </w:p>
     <w:p>
       <w:pPr>
-        <w:spacing w:after="160"/>
+        <w:spacing w:after="120" w:line="276" w:lineRule="auto"/>
+        <w:jc w:val="left"/>
       </w:pPr>
       <w:r>
         <w:rPr>
-          <w:rFonts w:ascii="Arial" w:hAnsi="Arial"/>
+          <w:rFonts w:ascii="Arial" w:hAnsi="Arial" w:cs="Arial"/>
           <w:b w:val="0"/>
           <w:i/>
+          <w:color w:val="000000"/>
           <w:sz w:val="22"/>
         </w:rPr>
         <w:t>Jawapan model:</w:t>
       </w:r>
       <w:r>
         <w:rPr>
-          <w:rFonts w:ascii="Arial" w:hAnsi="Arial"/>
+          <w:rFonts w:ascii="Arial" w:hAnsi="Arial" w:cs="Arial"/>
           <w:b w:val="0"/>
           <w:i w:val="0"/>
+          <w:color w:val="000000"/>
           <w:sz w:val="22"/>
         </w:rPr>
         <w:t xml:space="preserve"> (i) Garis panduan tanggungjawab kerja, (ii) Prosedur kerja, (iii) Tatacara kerja, (iv) Arahan kerja. Contohnya di studio penyuntingan video: huraian jawatan </w:t>
       </w:r>
       <w:r>
         <w:rPr>
-          <w:rFonts w:ascii="Arial" w:hAnsi="Arial"/>
+          <w:rFonts w:ascii="Arial" w:hAnsi="Arial" w:cs="Arial"/>
           <w:b w:val="0"/>
           <w:i/>
+          <w:color w:val="000000"/>
           <w:sz w:val="22"/>
         </w:rPr>
         <w:t>Assistant Editor</w:t>
       </w:r>
       <w:r>
         <w:rPr>
-          <w:rFonts w:ascii="Arial" w:hAnsi="Arial"/>
+          <w:rFonts w:ascii="Arial" w:hAnsi="Arial" w:cs="Arial"/>
           <w:b w:val="0"/>
           <w:i w:val="0"/>
+          <w:color w:val="000000"/>
           <w:sz w:val="22"/>
         </w:rPr>
         <w:t xml:space="preserve"> (garis panduan), prosedur </w:t>
       </w:r>
       <w:r>
         <w:rPr>
-          <w:rFonts w:ascii="Arial" w:hAnsi="Arial"/>
+          <w:rFonts w:ascii="Arial" w:hAnsi="Arial" w:cs="Arial"/>
           <w:b w:val="0"/>
           <w:i/>
+          <w:color w:val="000000"/>
           <w:sz w:val="22"/>
         </w:rPr>
         <w:t>export final cut</w:t>
       </w:r>
       <w:r>
         <w:rPr>
-          <w:rFonts w:ascii="Arial" w:hAnsi="Arial"/>
+          <w:rFonts w:ascii="Arial" w:hAnsi="Arial" w:cs="Arial"/>
           <w:b w:val="0"/>
           <w:i w:val="0"/>
+          <w:color w:val="000000"/>
           <w:sz w:val="22"/>
         </w:rPr>
         <w:t xml:space="preserve"> (prosedur kerja), tatacara </w:t>
       </w:r>
       <w:r>
         <w:rPr>
-          <w:rFonts w:ascii="Arial" w:hAnsi="Arial"/>
+          <w:rFonts w:ascii="Arial" w:hAnsi="Arial" w:cs="Arial"/>
           <w:b w:val="0"/>
           <w:i/>
+          <w:color w:val="000000"/>
           <w:sz w:val="22"/>
         </w:rPr>
         <w:t>ingest &amp; backup</w:t>
       </w:r>
       <w:r>
         <w:rPr>
-          <w:rFonts w:ascii="Arial" w:hAnsi="Arial"/>
+          <w:rFonts w:ascii="Arial" w:hAnsi="Arial" w:cs="Arial"/>
           <w:b w:val="0"/>
           <w:i w:val="0"/>
+          <w:color w:val="000000"/>
           <w:sz w:val="22"/>
         </w:rPr>
         <w:t xml:space="preserve"> footage (tatacara kerja), dan arahan langkah demi langkah sesi </w:t>
       </w:r>
       <w:r>
         <w:rPr>
-          <w:rFonts w:ascii="Arial" w:hAnsi="Arial"/>
+          <w:rFonts w:ascii="Arial" w:hAnsi="Arial" w:cs="Arial"/>
           <w:b w:val="0"/>
           <w:i/>
+          <w:color w:val="000000"/>
           <w:sz w:val="22"/>
         </w:rPr>
         <w:t>color grading</w:t>
       </w:r>
       <w:r>
         <w:rPr>
-          <w:rFonts w:ascii="Arial" w:hAnsi="Arial"/>
+          <w:rFonts w:ascii="Arial" w:hAnsi="Arial" w:cs="Arial"/>
           <w:b w:val="0"/>
           <w:i w:val="0"/>
+          <w:color w:val="000000"/>
           <w:sz w:val="22"/>
         </w:rPr>
         <w:t xml:space="preserve"> (arahan kerja).</w:t>
@@ -2332,13 +3262,15 @@
     </w:p>
     <w:p>
       <w:pPr>
-        <w:spacing w:after="160"/>
+        <w:spacing w:after="120" w:before="120" w:line="276" w:lineRule="auto"/>
+        <w:jc w:val="left"/>
       </w:pPr>
       <w:r>
         <w:rPr>
-          <w:rFonts w:ascii="Arial" w:hAnsi="Arial"/>
+          <w:rFonts w:ascii="Arial" w:hAnsi="Arial" w:cs="Arial"/>
           <w:b/>
           <w:i w:val="0"/>
+          <w:color w:val="000000"/>
           <w:sz w:val="22"/>
         </w:rPr>
         <w:t>4. Apakah kegunaan tatacara kerja?</w:t>
@@ -2346,58 +3278,65 @@
     </w:p>
     <w:p>
       <w:pPr>
-        <w:spacing w:after="160"/>
+        <w:spacing w:after="120" w:line="276" w:lineRule="auto"/>
+        <w:jc w:val="left"/>
       </w:pPr>
       <w:r>
         <w:rPr>
-          <w:rFonts w:ascii="Arial" w:hAnsi="Arial"/>
+          <w:rFonts w:ascii="Arial" w:hAnsi="Arial" w:cs="Arial"/>
           <w:b w:val="0"/>
           <w:i/>
+          <w:color w:val="000000"/>
           <w:sz w:val="22"/>
         </w:rPr>
         <w:t>Jawapan model:</w:t>
       </w:r>
       <w:r>
         <w:rPr>
-          <w:rFonts w:ascii="Arial" w:hAnsi="Arial"/>
+          <w:rFonts w:ascii="Arial" w:hAnsi="Arial" w:cs="Arial"/>
           <w:b w:val="0"/>
           <w:i w:val="0"/>
+          <w:color w:val="000000"/>
           <w:sz w:val="22"/>
         </w:rPr>
         <w:t xml:space="preserve"> Tatacara kerja memastikan konsistensi prestasi, membolehkan penambahbaikan berterusan, membenarkan pengukuran prestasi secara adil, meningkatkan keselamatan kerja, dan memudahkan latihan pekerja baharu — contohnya tatacara </w:t>
       </w:r>
       <w:r>
         <w:rPr>
-          <w:rFonts w:ascii="Arial" w:hAnsi="Arial"/>
+          <w:rFonts w:ascii="Arial" w:hAnsi="Arial" w:cs="Arial"/>
           <w:b w:val="0"/>
           <w:i/>
+          <w:color w:val="000000"/>
           <w:sz w:val="22"/>
         </w:rPr>
         <w:t>backup</w:t>
       </w:r>
       <w:r>
         <w:rPr>
-          <w:rFonts w:ascii="Arial" w:hAnsi="Arial"/>
+          <w:rFonts w:ascii="Arial" w:hAnsi="Arial" w:cs="Arial"/>
           <w:b w:val="0"/>
           <w:i w:val="0"/>
+          <w:color w:val="000000"/>
           <w:sz w:val="22"/>
         </w:rPr>
         <w:t xml:space="preserve"> footage klien yang piawai di studio penyuntingan video memastikan tiada fail hilang tanpa mengira siapa </w:t>
       </w:r>
       <w:r>
         <w:rPr>
-          <w:rFonts w:ascii="Arial" w:hAnsi="Arial"/>
+          <w:rFonts w:ascii="Arial" w:hAnsi="Arial" w:cs="Arial"/>
           <w:b w:val="0"/>
           <w:i/>
+          <w:color w:val="000000"/>
           <w:sz w:val="22"/>
         </w:rPr>
         <w:t>Editor</w:t>
       </w:r>
       <w:r>
         <w:rPr>
-          <w:rFonts w:ascii="Arial" w:hAnsi="Arial"/>
+          <w:rFonts w:ascii="Arial" w:hAnsi="Arial" w:cs="Arial"/>
           <w:b w:val="0"/>
           <w:i w:val="0"/>
+          <w:color w:val="000000"/>
           <w:sz w:val="22"/>
         </w:rPr>
         <w:t xml:space="preserve"> yang menjalankannya.</w:t>
@@ -2405,13 +3344,15 @@
     </w:p>
     <w:p>
       <w:pPr>
-        <w:spacing w:after="160"/>
+        <w:spacing w:after="120" w:before="120" w:line="276" w:lineRule="auto"/>
+        <w:jc w:val="left"/>
       </w:pPr>
       <w:r>
         <w:rPr>
-          <w:rFonts w:ascii="Arial" w:hAnsi="Arial"/>
+          <w:rFonts w:ascii="Arial" w:hAnsi="Arial" w:cs="Arial"/>
           <w:b/>
           <w:i w:val="0"/>
+          <w:color w:val="000000"/>
           <w:sz w:val="22"/>
         </w:rPr>
         <w:t>5. Apakah perbezaan antara tatacara kerja dan arahan kerja?</w:t>
@@ -2419,148 +3360,169 @@
     </w:p>
     <w:p>
       <w:pPr>
-        <w:spacing w:after="160"/>
+        <w:spacing w:after="120" w:line="276" w:lineRule="auto"/>
+        <w:jc w:val="left"/>
       </w:pPr>
       <w:r>
         <w:rPr>
-          <w:rFonts w:ascii="Arial" w:hAnsi="Arial"/>
+          <w:rFonts w:ascii="Arial" w:hAnsi="Arial" w:cs="Arial"/>
           <w:b w:val="0"/>
           <w:i/>
+          <w:color w:val="000000"/>
           <w:sz w:val="22"/>
         </w:rPr>
         <w:t>Jawapan model:</w:t>
       </w:r>
       <w:r>
         <w:rPr>
-          <w:rFonts w:ascii="Arial" w:hAnsi="Arial"/>
+          <w:rFonts w:ascii="Arial" w:hAnsi="Arial" w:cs="Arial"/>
           <w:b w:val="0"/>
           <w:i w:val="0"/>
+          <w:color w:val="000000"/>
           <w:sz w:val="22"/>
         </w:rPr>
         <w:t xml:space="preserve"> Tatacara kerja </w:t>
       </w:r>
       <w:r>
         <w:rPr>
-          <w:rFonts w:ascii="Arial" w:hAnsi="Arial"/>
+          <w:rFonts w:ascii="Arial" w:hAnsi="Arial" w:cs="Arial"/>
           <w:b w:val="0"/>
           <w:i/>
+          <w:color w:val="000000"/>
           <w:sz w:val="22"/>
         </w:rPr>
         <w:t>(working procedure)</w:t>
       </w:r>
       <w:r>
         <w:rPr>
-          <w:rFonts w:ascii="Arial" w:hAnsi="Arial"/>
+          <w:rFonts w:ascii="Arial" w:hAnsi="Arial" w:cs="Arial"/>
           <w:b w:val="0"/>
           <w:i w:val="0"/>
+          <w:color w:val="000000"/>
           <w:sz w:val="22"/>
         </w:rPr>
         <w:t xml:space="preserve"> menerangkan urutan langkah keseluruhan untuk melaksanakan sesuatu tugas secara umum bagi memastikan konsistensi dan keselamatan, manakala arahan kerja </w:t>
       </w:r>
       <w:r>
         <w:rPr>
-          <w:rFonts w:ascii="Arial" w:hAnsi="Arial"/>
+          <w:rFonts w:ascii="Arial" w:hAnsi="Arial" w:cs="Arial"/>
           <w:b w:val="0"/>
           <w:i/>
+          <w:color w:val="000000"/>
           <w:sz w:val="22"/>
         </w:rPr>
         <w:t>(working instruction)</w:t>
       </w:r>
       <w:r>
         <w:rPr>
-          <w:rFonts w:ascii="Arial" w:hAnsi="Arial"/>
+          <w:rFonts w:ascii="Arial" w:hAnsi="Arial" w:cs="Arial"/>
           <w:b w:val="0"/>
           <w:i w:val="0"/>
+          <w:color w:val="000000"/>
           <w:sz w:val="22"/>
         </w:rPr>
         <w:t xml:space="preserve"> adalah panduan lebih terperinci dan spesifik bagi membantu seseorang pekerja melaksanakan satu tugas tertentu dengan betul, biasanya disertai tanda, gambar/grafik dan kapsyen. Contohnya, tatacara kerja </w:t>
       </w:r>
       <w:r>
         <w:rPr>
-          <w:rFonts w:ascii="Arial" w:hAnsi="Arial"/>
+          <w:rFonts w:ascii="Arial" w:hAnsi="Arial" w:cs="Arial"/>
           <w:b w:val="0"/>
           <w:i/>
+          <w:color w:val="000000"/>
           <w:sz w:val="22"/>
         </w:rPr>
         <w:t>ingest footage</w:t>
       </w:r>
       <w:r>
         <w:rPr>
-          <w:rFonts w:ascii="Arial" w:hAnsi="Arial"/>
+          <w:rFonts w:ascii="Arial" w:hAnsi="Arial" w:cs="Arial"/>
           <w:b w:val="0"/>
           <w:i w:val="0"/>
+          <w:color w:val="000000"/>
           <w:sz w:val="22"/>
         </w:rPr>
         <w:t xml:space="preserve"> menerangkan aliran kerja keseluruhan studio, manakala arahan kerja menerangkan langkah tepat memasang kad memori kamera ke </w:t>
       </w:r>
       <w:r>
         <w:rPr>
-          <w:rFonts w:ascii="Arial" w:hAnsi="Arial"/>
+          <w:rFonts w:ascii="Arial" w:hAnsi="Arial" w:cs="Arial"/>
           <w:b w:val="0"/>
           <w:i/>
+          <w:color w:val="000000"/>
           <w:sz w:val="22"/>
         </w:rPr>
         <w:t>card reader</w:t>
       </w:r>
       <w:r>
         <w:rPr>
-          <w:rFonts w:ascii="Arial" w:hAnsi="Arial"/>
+          <w:rFonts w:ascii="Arial" w:hAnsi="Arial" w:cs="Arial"/>
           <w:b w:val="0"/>
           <w:i w:val="0"/>
+          <w:color w:val="000000"/>
           <w:sz w:val="22"/>
         </w:rPr>
         <w:t xml:space="preserve"> dan menyalin fail ke </w:t>
       </w:r>
       <w:r>
         <w:rPr>
-          <w:rFonts w:ascii="Arial" w:hAnsi="Arial"/>
+          <w:rFonts w:ascii="Arial" w:hAnsi="Arial" w:cs="Arial"/>
           <w:b w:val="0"/>
           <w:i/>
+          <w:color w:val="000000"/>
           <w:sz w:val="22"/>
         </w:rPr>
         <w:t>server</w:t>
       </w:r>
       <w:r>
         <w:rPr>
-          <w:rFonts w:ascii="Arial" w:hAnsi="Arial"/>
+          <w:rFonts w:ascii="Arial" w:hAnsi="Arial" w:cs="Arial"/>
           <w:b w:val="0"/>
           <w:i w:val="0"/>
+          <w:color w:val="000000"/>
           <w:sz w:val="22"/>
         </w:rPr>
         <w:t>.</w:t>
       </w:r>
     </w:p>
     <w:p>
+      <w:pPr>
+        <w:spacing w:before="120" w:after="120" w:line="276" w:lineRule="auto"/>
+        <w:jc w:val="left"/>
+      </w:pPr>
       <w:r>
         <w:rPr>
-          <w:rFonts w:ascii="Arial" w:hAnsi="Arial"/>
+          <w:rFonts w:ascii="Arial" w:hAnsi="Arial" w:cs="Arial"/>
           <w:b/>
-          <w:sz w:val="24"/>
+          <w:color w:val="000000"/>
+          <w:sz w:val="22"/>
         </w:rPr>
         <w:t>RUJUKAN</w:t>
       </w:r>
       <w:r>
         <w:rPr>
-          <w:rFonts w:ascii="Arial" w:hAnsi="Arial"/>
+          <w:rFonts w:ascii="Arial" w:hAnsi="Arial" w:cs="Arial"/>
           <w:b/>
-          <w:sz w:val="24"/>
+          <w:color w:val="000000"/>
+          <w:sz w:val="22"/>
         </w:rPr>
         <w:t>/</w:t>
       </w:r>
       <w:r>
         <w:rPr>
-          <w:rFonts w:ascii="Arial" w:hAnsi="Arial"/>
+          <w:rFonts w:ascii="Arial" w:hAnsi="Arial" w:cs="Arial"/>
           <w:b/>
           <w:i/>
-          <w:sz w:val="24"/>
+          <w:color w:val="000000"/>
+          <w:sz w:val="22"/>
         </w:rPr>
         <w:t>REFERENCES</w:t>
       </w:r>
       <w:r>
         <w:rPr>
-          <w:rFonts w:ascii="Arial" w:hAnsi="Arial"/>
+          <w:rFonts w:ascii="Arial" w:hAnsi="Arial" w:cs="Arial"/>
           <w:b/>
-          <w:sz w:val="24"/>
+          <w:color w:val="000000"/>
+          <w:sz w:val="22"/>
         </w:rPr>
         <w:t>:</w:t>
       </w:r>
@@ -2568,13 +3530,15 @@
     <w:p/>
     <w:p>
       <w:pPr>
-        <w:spacing w:after="160"/>
+        <w:spacing w:after="120" w:line="276" w:lineRule="auto"/>
+        <w:jc w:val="left"/>
       </w:pPr>
       <w:r>
         <w:rPr>
-          <w:rFonts w:ascii="Arial" w:hAnsi="Arial"/>
+          <w:rFonts w:ascii="Arial" w:hAnsi="Arial" w:cs="Arial"/>
           <w:b w:val="0"/>
           <w:i w:val="0"/>
+          <w:color w:val="000000"/>
           <w:sz w:val="22"/>
         </w:rPr>
         <w:t>1. https://en.wikipedia.org/wiki/Working_language</w:t>
@@ -2582,13 +3546,15 @@
     </w:p>
     <w:p>
       <w:pPr>
-        <w:spacing w:after="160"/>
+        <w:spacing w:after="120" w:line="276" w:lineRule="auto"/>
+        <w:jc w:val="left"/>
       </w:pPr>
       <w:r>
         <w:rPr>
-          <w:rFonts w:ascii="Arial" w:hAnsi="Arial"/>
+          <w:rFonts w:ascii="Arial" w:hAnsi="Arial" w:cs="Arial"/>
           <w:b w:val="0"/>
           <w:i w:val="0"/>
+          <w:color w:val="000000"/>
           <w:sz w:val="22"/>
         </w:rPr>
         <w:t>2. http://www.wisegeek.com/what-is-a-working-language.htm</w:t>
@@ -2596,13 +3562,15 @@
     </w:p>
     <w:p>
       <w:pPr>
-        <w:spacing w:after="160"/>
+        <w:spacing w:after="120" w:line="276" w:lineRule="auto"/>
+        <w:jc w:val="left"/>
       </w:pPr>
       <w:r>
         <w:rPr>
-          <w:rFonts w:ascii="Arial" w:hAnsi="Arial"/>
+          <w:rFonts w:ascii="Arial" w:hAnsi="Arial" w:cs="Arial"/>
           <w:b w:val="0"/>
           <w:i w:val="0"/>
+          <w:color w:val="000000"/>
           <w:sz w:val="22"/>
         </w:rPr>
         <w:t>3. http://www.bpsc.ca/procedure.html</w:t>
@@ -2610,13 +3578,15 @@
     </w:p>
     <w:p>
       <w:pPr>
-        <w:spacing w:after="160"/>
+        <w:spacing w:after="120" w:line="276" w:lineRule="auto"/>
+        <w:jc w:val="left"/>
       </w:pPr>
       <w:r>
         <w:rPr>
-          <w:rFonts w:ascii="Arial" w:hAnsi="Arial"/>
+          <w:rFonts w:ascii="Arial" w:hAnsi="Arial" w:cs="Arial"/>
           <w:b w:val="0"/>
           <w:i w:val="0"/>
+          <w:color w:val="000000"/>
           <w:sz w:val="22"/>
         </w:rPr>
         <w:t>4. http://www.naukrihub.com/payroll/job-analysis/</w:t>
@@ -2624,13 +3594,15 @@
     </w:p>
     <w:p>
       <w:pPr>
-        <w:spacing w:after="160"/>
+        <w:spacing w:after="120" w:line="276" w:lineRule="auto"/>
+        <w:jc w:val="left"/>
       </w:pPr>
       <w:r>
         <w:rPr>
-          <w:rFonts w:ascii="Arial" w:hAnsi="Arial"/>
+          <w:rFonts w:ascii="Arial" w:hAnsi="Arial" w:cs="Arial"/>
           <w:b w:val="0"/>
           <w:i w:val="0"/>
+          <w:color w:val="000000"/>
           <w:sz w:val="22"/>
         </w:rPr>
         <w:t>5. http://www.productionmachining.com/articles/the-reason-for-work-instructions</w:t>
@@ -2703,623 +3675,8 @@
     <w:pPr>
       <w:pStyle w:val="Header"/>
     </w:pPr>
+    <w:r/>
   </w:p>
-  <w:tbl>
-    <w:tblPr>
-      <w:tblW w:type="auto" w:w="0"/>
-      <w:jc w:val="center"/>
-      <w:tblLook w:firstColumn="1" w:firstRow="1" w:lastColumn="0" w:lastRow="0" w:noHBand="0" w:noVBand="1" w:val="04A0"/>
-      <w:tblBorders>
-        <w:top w:val="single" w:sz="4" w:space="0" w:color="000000"/>
-        <w:left w:val="single" w:sz="4" w:space="0" w:color="000000"/>
-        <w:bottom w:val="single" w:sz="4" w:space="0" w:color="000000"/>
-        <w:right w:val="single" w:sz="4" w:space="0" w:color="000000"/>
-        <w:insideH w:val="single" w:sz="4" w:space="0" w:color="000000"/>
-        <w:insideV w:val="single" w:sz="4" w:space="0" w:color="000000"/>
-      </w:tblBorders>
-    </w:tblPr>
-    <w:tblGrid>
-      <w:gridCol w:w="3213"/>
-      <w:gridCol w:w="3213"/>
-      <w:gridCol w:w="3213"/>
-    </w:tblGrid>
-    <w:tr>
-      <w:tc>
-        <w:tcPr>
-          <w:tcW w:type="dxa" w:w="2551"/>
-          <w:vAlign w:val="center"/>
-          <w:tcMar>
-            <w:top w:w="40" w:type="dxa"/>
-            <w:bottom w:w="40" w:type="dxa"/>
-            <w:start w:w="80" w:type="dxa"/>
-            <w:end w:w="80" w:type="dxa"/>
-          </w:tcMar>
-        </w:tcPr>
-        <w:p>
-          <w:pPr>
-            <w:jc w:val="left"/>
-          </w:pPr>
-          <w:r>
-            <w:drawing>
-              <wp:inline xmlns:a="http://schemas.openxmlformats.org/drawingml/2006/main" xmlns:pic="http://schemas.openxmlformats.org/drawingml/2006/picture">
-                <wp:extent cx="885785" cy="1404000"/>
-                <wp:docPr id="1" name="Picture 1"/>
-                <wp:cNvGraphicFramePr>
-                  <a:graphicFrameLocks noChangeAspect="1"/>
-                </wp:cNvGraphicFramePr>
-                <a:graphic>
-                  <a:graphicData uri="http://schemas.openxmlformats.org/drawingml/2006/picture">
-                    <pic:pic>
-                      <pic:nvPicPr>
-                        <pic:cNvPr id="0" name="jpk-logo-official.png"/>
-                        <pic:cNvPicPr/>
-                      </pic:nvPicPr>
-                      <pic:blipFill>
-                        <a:blip r:embed="rId1"/>
-                        <a:stretch>
-                          <a:fillRect/>
-                        </a:stretch>
-                      </pic:blipFill>
-                      <pic:spPr>
-                        <a:xfrm>
-                          <a:off x="0" y="0"/>
-                          <a:ext cx="885785" cy="1404000"/>
-                        </a:xfrm>
-                        <a:prstGeom prst="rect"/>
-                      </pic:spPr>
-                    </pic:pic>
-                  </a:graphicData>
-                </a:graphic>
-              </wp:inline>
-            </w:drawing>
-          </w:r>
-        </w:p>
-      </w:tc>
-      <w:tc>
-        <w:tcPr>
-          <w:tcW w:type="dxa" w:w="2268"/>
-          <w:gridSpan w:val="2"/>
-          <w:tcMar>
-            <w:top w:w="40" w:type="dxa"/>
-            <w:bottom w:w="40" w:type="dxa"/>
-            <w:start w:w="80" w:type="dxa"/>
-            <w:end w:w="80" w:type="dxa"/>
-          </w:tcMar>
-          <w:tcMar>
-            <w:top w:w="40" w:type="dxa"/>
-            <w:bottom w:w="40" w:type="dxa"/>
-            <w:start w:w="80" w:type="dxa"/>
-            <w:end w:w="80" w:type="dxa"/>
-          </w:tcMar>
-        </w:tcPr>
-        <w:p>
-          <w:r/>
-          <w:r>
-            <w:rPr>
-              <w:rFonts w:ascii="Arial" w:hAnsi="Arial"/>
-              <w:b/>
-              <w:sz w:val="22"/>
-            </w:rPr>
-            <w:t>JABATAN PEMBANGUNAN KEMAHIRAN</w:t>
-          </w:r>
-        </w:p>
-        <w:p>
-          <w:r>
-            <w:rPr>
-              <w:rFonts w:ascii="Arial" w:hAnsi="Arial"/>
-              <w:b/>
-              <w:sz w:val="22"/>
-            </w:rPr>
-            <w:t>KEMENTERIAN SUMBER MANUSIA</w:t>
-          </w:r>
-        </w:p>
-        <w:p>
-          <w:r>
-            <w:rPr>
-              <w:rFonts w:ascii="Arial" w:hAnsi="Arial"/>
-              <w:b/>
-              <w:sz w:val="22"/>
-            </w:rPr>
-            <w:t>ARAS 7 &amp; 8 BLOK D4, KOMPLEK D</w:t>
-          </w:r>
-        </w:p>
-        <w:p>
-          <w:r>
-            <w:rPr>
-              <w:rFonts w:ascii="Arial" w:hAnsi="Arial"/>
-              <w:b/>
-              <w:sz w:val="22"/>
-            </w:rPr>
-            <w:t>PUSAT PENTADBIRAN KERAJAAN PERSEKUTUAN</w:t>
-          </w:r>
-        </w:p>
-        <w:p>
-          <w:r>
-            <w:rPr>
-              <w:rFonts w:ascii="Arial" w:hAnsi="Arial"/>
-              <w:b/>
-              <w:sz w:val="22"/>
-            </w:rPr>
-            <w:t>62530 PUTRAJAYA</w:t>
-          </w:r>
-        </w:p>
-        <w:p/>
-        <w:p>
-          <w:r>
-            <w:rPr>
-              <w:rFonts w:ascii="Arial" w:hAnsi="Arial"/>
-              <w:b/>
-              <w:sz w:val="40"/>
-            </w:rPr>
-            <w:t>KERTAS PENERANGAN</w:t>
-          </w:r>
-        </w:p>
-        <w:p>
-          <w:r>
-            <w:rPr>
-              <w:rFonts w:ascii="Arial" w:hAnsi="Arial"/>
-              <w:b/>
-              <w:sz w:val="24"/>
-            </w:rPr>
-            <w:t>(</w:t>
-          </w:r>
-          <w:r>
-            <w:rPr>
-              <w:rFonts w:ascii="Arial" w:hAnsi="Arial"/>
-              <w:b/>
-              <w:i/>
-              <w:sz w:val="24"/>
-            </w:rPr>
-            <w:t>INFORMATION SHEET</w:t>
-          </w:r>
-          <w:r>
-            <w:rPr>
-              <w:rFonts w:ascii="Arial" w:hAnsi="Arial"/>
-              <w:b/>
-              <w:sz w:val="24"/>
-            </w:rPr>
-            <w:t>)</w:t>
-          </w:r>
-        </w:p>
-      </w:tc>
-    </w:tr>
-    <w:tr>
-      <w:tc>
-        <w:tcPr>
-          <w:tcW w:type="dxa" w:w="2551"/>
-          <w:tcMar>
-            <w:top w:w="40" w:type="dxa"/>
-            <w:bottom w:w="40" w:type="dxa"/>
-            <w:start w:w="80" w:type="dxa"/>
-            <w:end w:w="80" w:type="dxa"/>
-          </w:tcMar>
-        </w:tcPr>
-        <w:p>
-          <w:r/>
-          <w:r>
-            <w:rPr>
-              <w:rFonts w:ascii="Arial" w:hAnsi="Arial"/>
-              <w:b/>
-              <w:sz w:val="22"/>
-            </w:rPr>
-            <w:t xml:space="preserve">KOD DAN NAMA PROGRAM / </w:t>
-          </w:r>
-          <w:r>
-            <w:rPr>
-              <w:rFonts w:ascii="Arial" w:hAnsi="Arial"/>
-              <w:b/>
-              <w:i/>
-              <w:sz w:val="22"/>
-            </w:rPr>
-            <w:t>PROGRAM'S CODE AND NAME</w:t>
-          </w:r>
-        </w:p>
-      </w:tc>
-      <w:tc>
-        <w:tcPr>
-          <w:tcW w:type="dxa" w:w="2268"/>
-          <w:gridSpan w:val="2"/>
-          <w:tcMar>
-            <w:top w:w="40" w:type="dxa"/>
-            <w:bottom w:w="40" w:type="dxa"/>
-            <w:start w:w="80" w:type="dxa"/>
-            <w:end w:w="80" w:type="dxa"/>
-          </w:tcMar>
-          <w:tcMar>
-            <w:top w:w="40" w:type="dxa"/>
-            <w:bottom w:w="40" w:type="dxa"/>
-            <w:start w:w="80" w:type="dxa"/>
-            <w:end w:w="80" w:type="dxa"/>
-          </w:tcMar>
-        </w:tcPr>
-        <w:p>
-          <w:r/>
-          <w:r>
-            <w:rPr>
-              <w:rFonts w:ascii="Arial" w:hAnsi="Arial"/>
-              <w:b/>
-              <w:i w:val="0"/>
-              <w:sz w:val="22"/>
-            </w:rPr>
-            <w:t>Z-009-1:2015 CORE ABILITIES (untuk program IT-072-3:2012 VIDEO / FILM (EDITING))</w:t>
-          </w:r>
-        </w:p>
-      </w:tc>
-    </w:tr>
-    <w:tr>
-      <w:tc>
-        <w:tcPr>
-          <w:tcW w:type="dxa" w:w="2551"/>
-          <w:tcMar>
-            <w:top w:w="40" w:type="dxa"/>
-            <w:bottom w:w="40" w:type="dxa"/>
-            <w:start w:w="80" w:type="dxa"/>
-            <w:end w:w="80" w:type="dxa"/>
-          </w:tcMar>
-        </w:tcPr>
-        <w:p>
-          <w:r/>
-          <w:r>
-            <w:rPr>
-              <w:rFonts w:ascii="Arial" w:hAnsi="Arial"/>
-              <w:b/>
-              <w:sz w:val="22"/>
-            </w:rPr>
-            <w:t xml:space="preserve">TAHAP / </w:t>
-          </w:r>
-          <w:r>
-            <w:rPr>
-              <w:rFonts w:ascii="Arial" w:hAnsi="Arial"/>
-              <w:b/>
-              <w:i/>
-              <w:sz w:val="22"/>
-            </w:rPr>
-            <w:t>LEVEL</w:t>
-          </w:r>
-        </w:p>
-      </w:tc>
-      <w:tc>
-        <w:tcPr>
-          <w:tcW w:type="dxa" w:w="2268"/>
-          <w:gridSpan w:val="2"/>
-          <w:tcMar>
-            <w:top w:w="40" w:type="dxa"/>
-            <w:bottom w:w="40" w:type="dxa"/>
-            <w:start w:w="80" w:type="dxa"/>
-            <w:end w:w="80" w:type="dxa"/>
-          </w:tcMar>
-          <w:tcMar>
-            <w:top w:w="40" w:type="dxa"/>
-            <w:bottom w:w="40" w:type="dxa"/>
-            <w:start w:w="80" w:type="dxa"/>
-            <w:end w:w="80" w:type="dxa"/>
-          </w:tcMar>
-        </w:tcPr>
-        <w:p>
-          <w:r/>
-          <w:r>
-            <w:rPr>
-              <w:rFonts w:ascii="Arial" w:hAnsi="Arial"/>
-              <w:b/>
-              <w:i w:val="0"/>
-              <w:sz w:val="22"/>
-            </w:rPr>
-            <w:t>1</w:t>
-          </w:r>
-        </w:p>
-      </w:tc>
-    </w:tr>
-    <w:tr>
-      <w:tc>
-        <w:tcPr>
-          <w:tcW w:type="dxa" w:w="2551"/>
-          <w:tcMar>
-            <w:top w:w="40" w:type="dxa"/>
-            <w:bottom w:w="40" w:type="dxa"/>
-            <w:start w:w="80" w:type="dxa"/>
-            <w:end w:w="80" w:type="dxa"/>
-          </w:tcMar>
-        </w:tcPr>
-        <w:p>
-          <w:r/>
-          <w:r>
-            <w:rPr>
-              <w:rFonts w:ascii="Arial" w:hAnsi="Arial"/>
-              <w:b/>
-              <w:sz w:val="22"/>
-            </w:rPr>
-            <w:t xml:space="preserve">NO. DAN TAJUK KEBOLEHAN TERAS / </w:t>
-          </w:r>
-          <w:r>
-            <w:rPr>
-              <w:rFonts w:ascii="Arial" w:hAnsi="Arial"/>
-              <w:b/>
-              <w:i/>
-              <w:sz w:val="22"/>
-            </w:rPr>
-            <w:t>CORE ABILITY NO. AND TITLE</w:t>
-          </w:r>
-        </w:p>
-      </w:tc>
-      <w:tc>
-        <w:tcPr>
-          <w:tcW w:type="dxa" w:w="2268"/>
-          <w:gridSpan w:val="2"/>
-          <w:tcMar>
-            <w:top w:w="40" w:type="dxa"/>
-            <w:bottom w:w="40" w:type="dxa"/>
-            <w:start w:w="80" w:type="dxa"/>
-            <w:end w:w="80" w:type="dxa"/>
-          </w:tcMar>
-          <w:tcMar>
-            <w:top w:w="40" w:type="dxa"/>
-            <w:bottom w:w="40" w:type="dxa"/>
-            <w:start w:w="80" w:type="dxa"/>
-            <w:end w:w="80" w:type="dxa"/>
-          </w:tcMar>
-        </w:tcPr>
-        <w:p>
-          <w:r/>
-          <w:r>
-            <w:rPr>
-              <w:rFonts w:ascii="Arial" w:hAnsi="Arial"/>
-              <w:b/>
-              <w:i w:val="0"/>
-              <w:sz w:val="22"/>
-            </w:rPr>
-            <w:t>CA01 BASIC WORKING COMMUNICATION (KEBOLEHAN KERJA ASAS KOMUNIKASI)</w:t>
-          </w:r>
-        </w:p>
-      </w:tc>
-    </w:tr>
-    <w:tr>
-      <w:tc>
-        <w:tcPr>
-          <w:tcW w:type="dxa" w:w="2551"/>
-          <w:tcMar>
-            <w:top w:w="40" w:type="dxa"/>
-            <w:bottom w:w="40" w:type="dxa"/>
-            <w:start w:w="80" w:type="dxa"/>
-            <w:end w:w="80" w:type="dxa"/>
-          </w:tcMar>
-        </w:tcPr>
-        <w:p>
-          <w:r/>
-          <w:r>
-            <w:rPr>
-              <w:rFonts w:ascii="Arial" w:hAnsi="Arial"/>
-              <w:b/>
-              <w:sz w:val="22"/>
-            </w:rPr>
-            <w:t xml:space="preserve">NO. DAN PENYATAAN KEBOLEHAN / </w:t>
-          </w:r>
-          <w:r>
-            <w:rPr>
-              <w:rFonts w:ascii="Arial" w:hAnsi="Arial"/>
-              <w:b/>
-              <w:i/>
-              <w:sz w:val="22"/>
-            </w:rPr>
-            <w:t>ABILITY NO. AND STATEMENT</w:t>
-          </w:r>
-        </w:p>
-      </w:tc>
-      <w:tc>
-        <w:tcPr>
-          <w:tcW w:type="dxa" w:w="2268"/>
-          <w:gridSpan w:val="2"/>
-          <w:tcMar>
-            <w:top w:w="40" w:type="dxa"/>
-            <w:bottom w:w="40" w:type="dxa"/>
-            <w:start w:w="80" w:type="dxa"/>
-            <w:end w:w="80" w:type="dxa"/>
-          </w:tcMar>
-          <w:tcMar>
-            <w:top w:w="40" w:type="dxa"/>
-            <w:bottom w:w="40" w:type="dxa"/>
-            <w:start w:w="80" w:type="dxa"/>
-            <w:end w:w="80" w:type="dxa"/>
-          </w:tcMar>
-        </w:tcPr>
-        <w:p>
-          <w:r/>
-          <w:r>
-            <w:rPr>
-              <w:rFonts w:ascii="Arial" w:hAnsi="Arial"/>
-              <w:b/>
-              <w:i w:val="0"/>
-              <w:sz w:val="22"/>
-            </w:rPr>
-            <w:t xml:space="preserve">01.01 APPLY WORKING LANGUAGE APPROPRIATE (ENGLISH / NATIONAL LANGUAGE ETC) </w:t>
-          </w:r>
-          <w:r>
-            <w:rPr>
-              <w:rFonts w:ascii="Arial" w:hAnsi="Arial"/>
-              <w:b/>
-              <w:i/>
-              <w:sz w:val="22"/>
-            </w:rPr>
-            <w:t>(Menggunakan bahasa kerja yang sesuai — Bahasa Inggeris / Bahasa Kebangsaan dsb.)</w:t>
-          </w:r>
-        </w:p>
-      </w:tc>
-    </w:tr>
-    <w:tr>
-      <w:tc>
-        <w:tcPr>
-          <w:tcW w:type="dxa" w:w="2551"/>
-          <w:tcMar>
-            <w:top w:w="40" w:type="dxa"/>
-            <w:bottom w:w="40" w:type="dxa"/>
-            <w:start w:w="80" w:type="dxa"/>
-            <w:end w:w="80" w:type="dxa"/>
-          </w:tcMar>
-        </w:tcPr>
-        <w:p>
-          <w:r/>
-          <w:r>
-            <w:rPr>
-              <w:rFonts w:ascii="Arial" w:hAnsi="Arial"/>
-              <w:b/>
-              <w:sz w:val="22"/>
-            </w:rPr>
-            <w:t xml:space="preserve">NO. KOD / </w:t>
-          </w:r>
-          <w:r>
-            <w:rPr>
-              <w:rFonts w:ascii="Arial" w:hAnsi="Arial"/>
-              <w:b/>
-              <w:i/>
-              <w:sz w:val="22"/>
-            </w:rPr>
-            <w:t>CODE NO.</w:t>
-          </w:r>
-        </w:p>
-      </w:tc>
-      <w:tc>
-        <w:tcPr>
-          <w:tcW w:type="dxa" w:w="4819"/>
-          <w:tcMar>
-            <w:top w:w="40" w:type="dxa"/>
-            <w:bottom w:w="40" w:type="dxa"/>
-            <w:start w:w="80" w:type="dxa"/>
-            <w:end w:w="80" w:type="dxa"/>
-          </w:tcMar>
-        </w:tcPr>
-        <w:p>
-          <w:r/>
-          <w:r>
-            <w:rPr>
-              <w:rFonts w:ascii="Arial" w:hAnsi="Arial"/>
-              <w:b/>
-              <w:i w:val="0"/>
-              <w:sz w:val="22"/>
-            </w:rPr>
-            <w:t>Z-009-1:2015-M01/P(1/3)</w:t>
-          </w:r>
-        </w:p>
-      </w:tc>
-      <w:tc>
-        <w:tcPr>
-          <w:tcW w:type="dxa" w:w="2268"/>
-          <w:tcMar>
-            <w:top w:w="40" w:type="dxa"/>
-            <w:bottom w:w="40" w:type="dxa"/>
-            <w:start w:w="80" w:type="dxa"/>
-            <w:end w:w="80" w:type="dxa"/>
-          </w:tcMar>
-        </w:tcPr>
-        <w:p>
-          <w:r/>
-          <w:r>
-            <w:rPr>
-              <w:rFonts w:ascii="Arial" w:hAnsi="Arial"/>
-              <w:b/>
-              <w:sz w:val="22"/>
-            </w:rPr>
-            <w:t xml:space="preserve">Mukasurat / </w:t>
-          </w:r>
-          <w:r>
-            <w:rPr>
-              <w:rFonts w:ascii="Arial" w:hAnsi="Arial"/>
-              <w:b/>
-              <w:i/>
-              <w:sz w:val="22"/>
-            </w:rPr>
-            <w:t>Page</w:t>
-          </w:r>
-          <w:r>
-            <w:rPr>
-              <w:rFonts w:ascii="Arial" w:hAnsi="Arial"/>
-              <w:b/>
-              <w:sz w:val="22"/>
-            </w:rPr>
-            <w:t xml:space="preserve"> : </w:t>
-          </w:r>
-          <w:r>
-            <w:rPr>
-              <w:rFonts w:ascii="Arial" w:hAnsi="Arial"/>
-              <w:b/>
-              <w:sz w:val="22"/>
-            </w:rPr>
-            <w:fldChar w:fldCharType="begin"/>
-            <w:instrText xml:space="preserve">PAGE</w:instrText>
-            <w:fldChar w:fldCharType="separate"/>
-            <w:t>1</w:t>
-            <w:fldChar w:fldCharType="end"/>
-          </w:r>
-        </w:p>
-        <w:p>
-          <w:r>
-            <w:rPr>
-              <w:rFonts w:ascii="Arial" w:hAnsi="Arial"/>
-              <w:b/>
-              <w:sz w:val="22"/>
-            </w:rPr>
-            <w:t xml:space="preserve">Drpd / </w:t>
-          </w:r>
-          <w:r>
-            <w:rPr>
-              <w:rFonts w:ascii="Arial" w:hAnsi="Arial"/>
-              <w:b/>
-              <w:i/>
-              <w:sz w:val="22"/>
-            </w:rPr>
-            <w:t>of</w:t>
-          </w:r>
-          <w:r>
-            <w:rPr>
-              <w:rFonts w:ascii="Arial" w:hAnsi="Arial"/>
-              <w:b/>
-              <w:sz w:val="22"/>
-            </w:rPr>
-            <w:t xml:space="preserve"> : </w:t>
-          </w:r>
-          <w:r>
-            <w:rPr>
-              <w:rFonts w:ascii="Arial" w:hAnsi="Arial"/>
-              <w:b/>
-              <w:sz w:val="22"/>
-            </w:rPr>
-            <w:fldChar w:fldCharType="begin"/>
-            <w:instrText xml:space="preserve">NUMPAGES</w:instrText>
-            <w:fldChar w:fldCharType="separate"/>
-            <w:t>1</w:t>
-            <w:fldChar w:fldCharType="end"/>
-          </w:r>
-        </w:p>
-      </w:tc>
-    </w:tr>
-    <w:tr>
-      <w:tc>
-        <w:tcPr>
-          <w:tcW w:type="dxa" w:w="2268"/>
-          <w:gridSpan w:val="3"/>
-          <w:tcMar>
-            <w:top w:w="40" w:type="dxa"/>
-            <w:bottom w:w="40" w:type="dxa"/>
-            <w:start w:w="80" w:type="dxa"/>
-            <w:end w:w="80" w:type="dxa"/>
-          </w:tcMar>
-          <w:tcMar>
-            <w:top w:w="40" w:type="dxa"/>
-            <w:bottom w:w="40" w:type="dxa"/>
-            <w:start w:w="80" w:type="dxa"/>
-            <w:end w:w="80" w:type="dxa"/>
-          </w:tcMar>
-          <w:tcMar>
-            <w:top w:w="40" w:type="dxa"/>
-            <w:bottom w:w="40" w:type="dxa"/>
-            <w:start w:w="80" w:type="dxa"/>
-            <w:end w:w="80" w:type="dxa"/>
-          </w:tcMar>
-        </w:tcPr>
-        <w:p>
-          <w:r/>
-        </w:p>
-      </w:tc>
-    </w:tr>
-  </w:tbl>
 </w:hdr>
 </file>
 

</xml_diff>